<commit_message>
Update Informe de Pasantias2.docx
</commit_message>
<xml_diff>
--- a/Informe de Pasantias/Informe de Pasantias2.docx
+++ b/Informe de Pasantias/Informe de Pasantias2.docx
@@ -1,6 +1,6 @@
 
 <file path=word/document.xml><?xml version="1.0" encoding="utf-8"?>
-<w:document xmlns:wpc="http://schemas.microsoft.com/office/word/2010/wordprocessingCanvas" xmlns:cx="http://schemas.microsoft.com/office/drawing/2014/chartex" xmlns:cx1="http://schemas.microsoft.com/office/drawing/2015/9/8/chartex" xmlns:cx2="http://schemas.microsoft.com/office/drawing/2015/10/21/chartex" xmlns:cx3="http://schemas.microsoft.com/office/drawing/2016/5/9/chartex" xmlns:cx4="http://schemas.microsoft.com/office/drawing/2016/5/10/chartex" xmlns:cx5="http://schemas.microsoft.com/office/drawing/2016/5/11/chartex" xmlns:cx6="http://schemas.microsoft.com/office/drawing/2016/5/12/chartex" xmlns:cx7="http://schemas.microsoft.com/office/drawing/2016/5/13/chartex" xmlns:cx8="http://schemas.microsoft.com/office/drawing/2016/5/14/chartex" xmlns:mc="http://schemas.openxmlformats.org/markup-compatibility/2006" xmlns:aink="http://schemas.microsoft.com/office/drawing/2016/ink" xmlns:am3d="http://schemas.microsoft.com/office/drawing/2017/model3d" xmlns:o="urn:schemas-microsoft-com:office:office" xmlns:oel="http://schemas.microsoft.com/office/2019/extlst" xmlns:r="http://schemas.openxmlformats.org/officeDocument/2006/relationships" xmlns:m="http://schemas.openxmlformats.org/officeDocument/2006/math" xmlns:v="urn:schemas-microsoft-com:vml" xmlns:wp14="http://schemas.microsoft.com/office/word/2010/wordprocessingDrawing" xmlns:wp="http://schemas.openxmlformats.org/drawingml/2006/wordprocessingDrawing" xmlns:w10="urn:schemas-microsoft-com:office:word" xmlns:w="http://schemas.openxmlformats.org/wordprocessingml/2006/main" xmlns:w14="http://schemas.microsoft.com/office/word/2010/wordml" xmlns:w15="http://schemas.microsoft.com/office/word/2012/wordml" xmlns:w16cex="http://schemas.microsoft.com/office/word/2018/wordml/cex" xmlns:w16cid="http://schemas.microsoft.com/office/word/2016/wordml/cid" xmlns:w16="http://schemas.microsoft.com/office/word/2018/wordml" xmlns:w16du="http://schemas.microsoft.com/office/word/2023/wordml/word16du" xmlns:w16sdtdh="http://schemas.microsoft.com/office/word/2020/wordml/sdtdatahash" xmlns:w16sdtfl="http://schemas.microsoft.com/office/word/2024/wordml/sdtformatlock" xmlns:w16se="http://schemas.microsoft.com/office/word/2015/wordml/symex" xmlns:wpg="http://schemas.microsoft.com/office/word/2010/wordprocessingGroup" xmlns:wpi="http://schemas.microsoft.com/office/word/2010/wordprocessingInk" xmlns:wne="http://schemas.microsoft.com/office/word/2006/wordml" xmlns:wps="http://schemas.microsoft.com/office/word/2010/wordprocessingShape" mc:Ignorable="w14 w15 w16se w16cid w16 w16cex w16sdtdh w16sdtfl w16du wp14">
+<w:document xmlns:wpc="http://schemas.microsoft.com/office/word/2010/wordprocessingCanvas" xmlns:cx="http://schemas.microsoft.com/office/drawing/2014/chartex" xmlns:cx1="http://schemas.microsoft.com/office/drawing/2015/9/8/chartex" xmlns:cx2="http://schemas.microsoft.com/office/drawing/2015/10/21/chartex" xmlns:cx3="http://schemas.microsoft.com/office/drawing/2016/5/9/chartex" xmlns:cx4="http://schemas.microsoft.com/office/drawing/2016/5/10/chartex" xmlns:cx5="http://schemas.microsoft.com/office/drawing/2016/5/11/chartex" xmlns:cx6="http://schemas.microsoft.com/office/drawing/2016/5/12/chartex" xmlns:cx7="http://schemas.microsoft.com/office/drawing/2016/5/13/chartex" xmlns:cx8="http://schemas.microsoft.com/office/drawing/2016/5/14/chartex" xmlns:mc="http://schemas.openxmlformats.org/markup-compatibility/2006" xmlns:aink="http://schemas.microsoft.com/office/drawing/2016/ink" xmlns:am3d="http://schemas.microsoft.com/office/drawing/2017/model3d" xmlns:o="urn:schemas-microsoft-com:office:office" xmlns:oel="http://schemas.microsoft.com/office/2019/extlst" xmlns:r="http://schemas.openxmlformats.org/officeDocument/2006/relationships" xmlns:m="http://schemas.openxmlformats.org/officeDocument/2006/math" xmlns:v="urn:schemas-microsoft-com:vml" xmlns:wp14="http://schemas.microsoft.com/office/word/2010/wordprocessingDrawing" xmlns:wp="http://schemas.openxmlformats.org/drawingml/2006/wordprocessingDrawing" xmlns:w10="urn:schemas-microsoft-com:office:word" xmlns:w="http://schemas.openxmlformats.org/wordprocessingml/2006/main" xmlns:w14="http://schemas.microsoft.com/office/word/2010/wordml" xmlns:w15="http://schemas.microsoft.com/office/word/2012/wordml" xmlns:w16cex="http://schemas.microsoft.com/office/word/2018/wordml/cex" xmlns:w16cid="http://schemas.microsoft.com/office/word/2016/wordml/cid" xmlns:w16="http://schemas.microsoft.com/office/word/2018/wordml" xmlns:w16sdtdh="http://schemas.microsoft.com/office/word/2020/wordml/sdtdatahash" xmlns:w16se="http://schemas.microsoft.com/office/word/2015/wordml/symex" xmlns:wpg="http://schemas.microsoft.com/office/word/2010/wordprocessingGroup" xmlns:wpi="http://schemas.microsoft.com/office/word/2010/wordprocessingInk" xmlns:wne="http://schemas.microsoft.com/office/word/2006/wordml" xmlns:wps="http://schemas.microsoft.com/office/word/2010/wordprocessingShape" mc:Ignorable="w14 w15 w16se w16cid w16 w16cex w16sdtdh wp14">
   <w:body>
     <w:p>
       <w:pPr>
@@ -717,60 +717,12 @@
     </w:p>
     <w:p>
       <w:pPr>
-        <w:spacing w:after="0" w:line="240" w:lineRule="auto"/>
-        <w:jc w:val="center"/>
         <w:rPr>
           <w:rFonts w:ascii="Arial" w:eastAsia="Times New Roman" w:hAnsi="Arial" w:cs="Arial"/>
           <w:b/>
           <w:kern w:val="0"/>
           <w:lang w:val="es-ES" w:eastAsia="es-ES"/>
           <w14:ligatures w14:val="none"/>
-        </w:rPr>
-      </w:pPr>
-    </w:p>
-    <w:p>
-      <w:pPr>
-        <w:rPr>
-          <w:rFonts w:ascii="Arial" w:eastAsia="Times New Roman" w:hAnsi="Arial" w:cs="Arial"/>
-          <w:b/>
-          <w:kern w:val="0"/>
-          <w:lang w:val="es-ES" w:eastAsia="es-ES"/>
-          <w14:ligatures w14:val="none"/>
-        </w:rPr>
-      </w:pPr>
-      <w:r>
-        <w:rPr>
-          <w:rFonts w:ascii="Arial" w:eastAsia="Times New Roman" w:hAnsi="Arial" w:cs="Arial"/>
-          <w:b/>
-          <w:kern w:val="0"/>
-          <w:lang w:val="es-ES" w:eastAsia="es-ES"/>
-          <w14:ligatures w14:val="none"/>
-        </w:rPr>
-        <w:br w:type="page"/>
-      </w:r>
-    </w:p>
-    <w:p>
-      <w:pPr>
-        <w:spacing w:line="360" w:lineRule="auto"/>
-        <w:jc w:val="center"/>
-        <w:rPr>
-          <w:rFonts w:ascii="Arial" w:hAnsi="Arial" w:cs="Arial"/>
-          <w:b/>
-          <w:bCs/>
-          <w:sz w:val="22"/>
-          <w:szCs w:val="22"/>
-        </w:rPr>
-      </w:pPr>
-    </w:p>
-    <w:p>
-      <w:pPr>
-        <w:jc w:val="center"/>
-        <w:rPr>
-          <w:rFonts w:ascii="Arial" w:hAnsi="Arial" w:cs="Arial"/>
-          <w:b/>
-          <w:bCs/>
-          <w:sz w:val="22"/>
-          <w:szCs w:val="22"/>
         </w:rPr>
       </w:pPr>
       <w:r>
@@ -1820,7 +1772,7 @@
               </wp:anchor>
             </w:drawing>
           </mc:Choice>
-          <mc:Fallback>
+          <mc:Fallback xmlns:w16sdtfl="http://schemas.microsoft.com/office/word/2024/wordml/sdtformatlock" xmlns:w16du="http://schemas.microsoft.com/office/word/2023/wordml/word16du">
             <w:pict>
               <v:group w14:anchorId="01622D93" id="Group 17" o:spid="_x0000_s1026" style="position:absolute;margin-left:-4.45pt;margin-top:9.2pt;width:450.2pt;height:127.25pt;z-index:251659264" coordorigin="2268,6021" coordsize="8280,2340" o:gfxdata="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">
                 <v:shapetype id="_x0000_t75" coordsize="21600,21600" o:spt="75" o:preferrelative="t" path="m@4@5l@4@11@9@11@9@5xe" filled="f" stroked="f">
@@ -2331,7 +2283,21 @@
         <w:rPr>
           <w:lang w:val="es-VE"/>
         </w:rPr>
-        <w:t>a como objeto la promoción, administración, gestión, coordinación de servicios de salud; la prestación de programas de salud; de afiliación de los usuarios; la administración de la prestación de los servicios de instituciones prestadoras de salud; servicio de internación; servicio de hospital de día; servicio hospitalarios de cirugía y maternidad; servicio de atención ambulatoria; servicio de atención domiciliaria programada; servicio odontológicos; servicio de diagnóstico; servicio de tratamiento; servicio de emergencia y traslado; servicios de medicina ocupacional; servicios de instalación de equipos odontológicos; servicios de instalación de equipos médico quirúrgicos; servicios de medicina hiperbárica; servicios de seguros de salud de medicina prepagada; servicios de ambulancias terrestres especializadas / atención pre-hospitalaria; así como la organización para la prestación de los servicios de salud a los afiliados del Sistema General de Seguridad Social en Salud</w:t>
+        <w:t xml:space="preserve">a como objeto la promoción, administración, gestión, coordinación de servicios de salud; la prestación de programas de salud; de afiliación de los usuarios; la administración de la prestación de los servicios de instituciones prestadoras de salud; servicio de internación; servicio de hospital de día; servicio hospitalarios de cirugía y maternidad; servicio de atención ambulatoria; servicio de atención domiciliaria programada; servicio odontológicos; servicio de diagnóstico; servicio de tratamiento; servicio de emergencia y traslado; servicios de medicina ocupacional; servicios de instalación de equipos odontológicos; servicios de instalación de equipos médico quirúrgicos; servicios de medicina hiperbárica; servicios de seguros de salud de medicina prepagada; servicios de ambulancias terrestres especializadas / atención </w:t>
+      </w:r>
+      <w:proofErr w:type="spellStart"/>
+      <w:r>
+        <w:rPr>
+          <w:lang w:val="es-VE"/>
+        </w:rPr>
+        <w:t>pre-hospitalaria</w:t>
+      </w:r>
+      <w:proofErr w:type="spellEnd"/>
+      <w:r>
+        <w:rPr>
+          <w:lang w:val="es-VE"/>
+        </w:rPr>
+        <w:t>; así como la organización para la prestación de los servicios de salud a los afiliados del Sistema General de Seguridad Social en Salud</w:t>
       </w:r>
       <w:r>
         <w:rPr>
@@ -3400,6 +3366,14 @@
           <w:lang w:val="es-VE"/>
         </w:rPr>
       </w:pPr>
+      <w:r>
+        <w:rPr>
+          <w:b/>
+          <w:bCs/>
+          <w:lang w:val="es-VE"/>
+        </w:rPr>
+        <w:t>Fuentes: Araujo (2026)</w:t>
+      </w:r>
     </w:p>
     <w:p>
       <w:pPr>
@@ -3838,7 +3812,7 @@
               </wp:anchor>
             </w:drawing>
           </mc:Choice>
-          <mc:Fallback>
+          <mc:Fallback xmlns:w16sdtfl="http://schemas.microsoft.com/office/word/2024/wordml/sdtformatlock" xmlns:w16du="http://schemas.microsoft.com/office/word/2023/wordml/word16du">
             <w:pict>
               <v:group w14:anchorId="70150167" id="Group 17" o:spid="_x0000_s1026" style="position:absolute;margin-left:-4.45pt;margin-top:9.2pt;width:450.2pt;height:127.25pt;z-index:251661312" coordorigin="2268,6021" coordsize="8280,2340" o:gfxdata="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">
                 <v:shape id="Imagen 2" o:spid="_x0000_s1027" type="#_x0000_t75" alt="Descripción: LOGO URBE 2012 DEFINITIVO-01" style="position:absolute;left:2268;top:6021;width:3000;height:2340;visibility:visible;mso-wrap-style:square" o:gfxdata="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">
@@ -4284,7 +4258,7 @@
         <w:tc>
           <w:tcPr>
             <w:tcW w:w="1634" w:type="dxa"/>
-            <w:shd w:val="clear" w:color="auto" w:fill="E8E8E8" w:themeFill="background2"/>
+            <w:shd w:val="clear" w:color="auto" w:fill="000000" w:themeFill="text1"/>
             <w:vAlign w:val="center"/>
           </w:tcPr>
           <w:p>
@@ -4295,6 +4269,8 @@
               <w:rPr>
                 <w:b/>
                 <w:bCs/>
+                <w:sz w:val="18"/>
+                <w:szCs w:val="18"/>
                 <w:lang w:val="es-VE"/>
               </w:rPr>
             </w:pPr>
@@ -4302,6 +4278,8 @@
               <w:rPr>
                 <w:b/>
                 <w:bCs/>
+                <w:sz w:val="18"/>
+                <w:szCs w:val="18"/>
                 <w:lang w:val="es-VE"/>
               </w:rPr>
               <w:t>Actividad</w:t>
@@ -4311,7 +4289,7 @@
         <w:tc>
           <w:tcPr>
             <w:tcW w:w="1621" w:type="dxa"/>
-            <w:shd w:val="clear" w:color="auto" w:fill="E8E8E8" w:themeFill="background2"/>
+            <w:shd w:val="clear" w:color="auto" w:fill="000000" w:themeFill="text1"/>
             <w:vAlign w:val="center"/>
           </w:tcPr>
           <w:p>
@@ -4322,6 +4300,8 @@
               <w:rPr>
                 <w:b/>
                 <w:bCs/>
+                <w:sz w:val="18"/>
+                <w:szCs w:val="18"/>
                 <w:lang w:val="es-VE"/>
               </w:rPr>
             </w:pPr>
@@ -4329,6 +4309,8 @@
               <w:rPr>
                 <w:b/>
                 <w:bCs/>
+                <w:sz w:val="18"/>
+                <w:szCs w:val="18"/>
                 <w:lang w:val="es-VE"/>
               </w:rPr>
               <w:t>Fecha de Inicio</w:t>
@@ -4338,7 +4320,7 @@
         <w:tc>
           <w:tcPr>
             <w:tcW w:w="1648" w:type="dxa"/>
-            <w:shd w:val="clear" w:color="auto" w:fill="E8E8E8" w:themeFill="background2"/>
+            <w:shd w:val="clear" w:color="auto" w:fill="000000" w:themeFill="text1"/>
             <w:vAlign w:val="center"/>
           </w:tcPr>
           <w:p>
@@ -4349,6 +4331,8 @@
               <w:rPr>
                 <w:b/>
                 <w:bCs/>
+                <w:sz w:val="18"/>
+                <w:szCs w:val="18"/>
                 <w:lang w:val="es-VE"/>
               </w:rPr>
             </w:pPr>
@@ -4356,6 +4340,8 @@
               <w:rPr>
                 <w:b/>
                 <w:bCs/>
+                <w:sz w:val="18"/>
+                <w:szCs w:val="18"/>
                 <w:lang w:val="es-VE"/>
               </w:rPr>
               <w:t>Fecha de Culminación</w:t>
@@ -4365,7 +4351,7 @@
         <w:tc>
           <w:tcPr>
             <w:tcW w:w="1652" w:type="dxa"/>
-            <w:shd w:val="clear" w:color="auto" w:fill="E8E8E8" w:themeFill="background2"/>
+            <w:shd w:val="clear" w:color="auto" w:fill="000000" w:themeFill="text1"/>
             <w:vAlign w:val="center"/>
           </w:tcPr>
           <w:p>
@@ -4376,6 +4362,8 @@
               <w:rPr>
                 <w:b/>
                 <w:bCs/>
+                <w:sz w:val="18"/>
+                <w:szCs w:val="18"/>
                 <w:lang w:val="es-VE"/>
               </w:rPr>
             </w:pPr>
@@ -4383,6 +4371,8 @@
               <w:rPr>
                 <w:b/>
                 <w:bCs/>
+                <w:sz w:val="18"/>
+                <w:szCs w:val="18"/>
                 <w:lang w:val="es-VE"/>
               </w:rPr>
               <w:t>Metodologías y Herramientas</w:t>
@@ -4392,7 +4382,7 @@
         <w:tc>
           <w:tcPr>
             <w:tcW w:w="1708" w:type="dxa"/>
-            <w:shd w:val="clear" w:color="auto" w:fill="E8E8E8" w:themeFill="background2"/>
+            <w:shd w:val="clear" w:color="auto" w:fill="000000" w:themeFill="text1"/>
             <w:vAlign w:val="center"/>
           </w:tcPr>
           <w:p>
@@ -4403,6 +4393,8 @@
               <w:rPr>
                 <w:b/>
                 <w:bCs/>
+                <w:sz w:val="18"/>
+                <w:szCs w:val="18"/>
                 <w:lang w:val="es-VE"/>
               </w:rPr>
             </w:pPr>
@@ -4410,9 +4402,21 @@
               <w:rPr>
                 <w:b/>
                 <w:bCs/>
+                <w:sz w:val="18"/>
+                <w:szCs w:val="18"/>
                 <w:lang w:val="es-VE"/>
               </w:rPr>
               <w:t>Responsables</w:t>
+            </w:r>
+            <w:r>
+              <w:rPr>
+                <w:b/>
+                <w:bCs/>
+                <w:sz w:val="18"/>
+                <w:szCs w:val="18"/>
+                <w:lang w:val="es-VE"/>
+              </w:rPr>
+              <w:t xml:space="preserve"> y/o personas involucradas (cargos)</w:t>
             </w:r>
           </w:p>
         </w:tc>
@@ -4433,7 +4437,6 @@
                 <w:bCs/>
                 <w:sz w:val="16"/>
                 <w:szCs w:val="16"/>
-                <w:lang w:val="es-VE"/>
               </w:rPr>
             </w:pPr>
             <w:r>
@@ -4443,26 +4446,26 @@
                 <w:sz w:val="16"/>
                 <w:szCs w:val="16"/>
               </w:rPr>
-              <w:t>Instalación de sistemas operativos, programas de oficina, antivirus y limpieza física de componentes.</w:t>
+              <w:t>Charla Introductoria y visita las instalaciones</w:t>
             </w:r>
           </w:p>
         </w:tc>
         <w:tc>
           <w:tcPr>
             <w:tcW w:w="1621" w:type="dxa"/>
+            <w:vAlign w:val="center"/>
           </w:tcPr>
           <w:p>
             <w:pPr>
               <w:pStyle w:val="pasantia"/>
               <w:spacing w:line="360" w:lineRule="auto"/>
               <w:ind w:firstLine="0"/>
-              <w:jc w:val="both"/>
-              <w:rPr>
-                <w:b/>
-                <w:bCs/>
-                <w:sz w:val="16"/>
-                <w:szCs w:val="16"/>
-                <w:lang w:val="es-VE"/>
+              <w:jc w:val="center"/>
+              <w:rPr>
+                <w:b/>
+                <w:bCs/>
+                <w:sz w:val="16"/>
+                <w:szCs w:val="16"/>
               </w:rPr>
             </w:pPr>
             <w:r>
@@ -4472,26 +4475,26 @@
                 <w:sz w:val="16"/>
                 <w:szCs w:val="16"/>
               </w:rPr>
-              <w:t>04/05/2026</w:t>
+              <w:t>27/04</w:t>
             </w:r>
           </w:p>
         </w:tc>
         <w:tc>
           <w:tcPr>
             <w:tcW w:w="1648" w:type="dxa"/>
+            <w:vAlign w:val="center"/>
           </w:tcPr>
           <w:p>
             <w:pPr>
               <w:pStyle w:val="pasantia"/>
               <w:spacing w:line="360" w:lineRule="auto"/>
               <w:ind w:firstLine="0"/>
-              <w:jc w:val="both"/>
-              <w:rPr>
-                <w:b/>
-                <w:bCs/>
-                <w:sz w:val="16"/>
-                <w:szCs w:val="16"/>
-                <w:lang w:val="es-VE"/>
+              <w:jc w:val="center"/>
+              <w:rPr>
+                <w:b/>
+                <w:bCs/>
+                <w:sz w:val="16"/>
+                <w:szCs w:val="16"/>
               </w:rPr>
             </w:pPr>
             <w:r>
@@ -4501,7 +4504,7 @@
                 <w:sz w:val="16"/>
                 <w:szCs w:val="16"/>
               </w:rPr>
-              <w:t>22/05/2026</w:t>
+              <w:t>30/04</w:t>
             </w:r>
           </w:p>
         </w:tc>
@@ -4513,78 +4516,6 @@
             <w:pPr>
               <w:pStyle w:val="pasantia"/>
               <w:spacing w:line="360" w:lineRule="auto"/>
-              <w:jc w:val="both"/>
-              <w:rPr>
-                <w:b/>
-                <w:bCs/>
-                <w:sz w:val="16"/>
-                <w:szCs w:val="16"/>
-                <w:lang w:val="es-VE"/>
-              </w:rPr>
-            </w:pPr>
-            <w:r>
-              <w:rPr>
-                <w:b/>
-                <w:bCs/>
-                <w:sz w:val="16"/>
-                <w:szCs w:val="16"/>
-                <w:lang w:val="es-VE"/>
-              </w:rPr>
-              <w:t>Metodología: Revisión directa por equipo e instalación mediante instaladores estándar.</w:t>
-            </w:r>
-          </w:p>
-          <w:p>
-            <w:pPr>
-              <w:pStyle w:val="pasantia"/>
-              <w:spacing w:line="360" w:lineRule="auto"/>
-              <w:jc w:val="both"/>
-              <w:rPr>
-                <w:b/>
-                <w:bCs/>
-                <w:sz w:val="16"/>
-                <w:szCs w:val="16"/>
-                <w:lang w:val="es-VE"/>
-              </w:rPr>
-            </w:pPr>
-            <w:r>
-              <w:rPr>
-                <w:b/>
-                <w:bCs/>
-                <w:sz w:val="16"/>
-                <w:szCs w:val="16"/>
-                <w:lang w:val="es-VE"/>
-              </w:rPr>
-              <w:br/>
-            </w:r>
-          </w:p>
-          <w:p>
-            <w:pPr>
-              <w:pStyle w:val="pasantia"/>
-              <w:spacing w:line="360" w:lineRule="auto"/>
-              <w:jc w:val="both"/>
-              <w:rPr>
-                <w:b/>
-                <w:bCs/>
-                <w:sz w:val="16"/>
-                <w:szCs w:val="16"/>
-                <w:lang w:val="es-VE"/>
-              </w:rPr>
-            </w:pPr>
-            <w:r>
-              <w:rPr>
-                <w:b/>
-                <w:bCs/>
-                <w:sz w:val="16"/>
-                <w:szCs w:val="16"/>
-                <w:lang w:val="es-VE"/>
-              </w:rPr>
-              <w:t>Herramientas: Unidades USB (Pendrives), destornilladores, sopladora, software básico.</w:t>
-            </w:r>
-          </w:p>
-          <w:p>
-            <w:pPr>
-              <w:pStyle w:val="pasantia"/>
-              <w:spacing w:line="360" w:lineRule="auto"/>
               <w:ind w:firstLine="0"/>
               <w:jc w:val="both"/>
               <w:rPr>
@@ -4595,6 +4526,26 @@
                 <w:lang w:val="es-VE"/>
               </w:rPr>
             </w:pPr>
+            <w:r>
+              <w:rPr>
+                <w:b/>
+                <w:bCs/>
+                <w:sz w:val="16"/>
+                <w:szCs w:val="16"/>
+                <w:lang w:val="es-VE"/>
+              </w:rPr>
+              <w:t>Observación directa</w:t>
+            </w:r>
+            <w:r>
+              <w:rPr>
+                <w:b/>
+                <w:bCs/>
+                <w:sz w:val="16"/>
+                <w:szCs w:val="16"/>
+                <w:lang w:val="es-VE"/>
+              </w:rPr>
+              <w:t>.</w:t>
+            </w:r>
           </w:p>
         </w:tc>
         <w:tc>
@@ -4612,7 +4563,6 @@
                 <w:bCs/>
                 <w:sz w:val="16"/>
                 <w:szCs w:val="16"/>
-                <w:lang w:val="es-VE"/>
               </w:rPr>
             </w:pPr>
             <w:r>
@@ -4622,27 +4572,148 @@
                 <w:sz w:val="16"/>
                 <w:szCs w:val="16"/>
               </w:rPr>
-              <w:t>Tutor Industrial (</w:t>
-            </w:r>
-            <w:proofErr w:type="gramStart"/>
-            <w:r>
-              <w:rPr>
-                <w:b/>
-                <w:bCs/>
-                <w:sz w:val="16"/>
-                <w:szCs w:val="16"/>
-              </w:rPr>
-              <w:t>Jefe</w:t>
-            </w:r>
-            <w:proofErr w:type="gramEnd"/>
-            <w:r>
-              <w:rPr>
-                <w:b/>
-                <w:bCs/>
-                <w:sz w:val="16"/>
-                <w:szCs w:val="16"/>
-              </w:rPr>
-              <w:t xml:space="preserve"> de TI) / Tutor Académico.</w:t>
+              <w:t>Jorge Araujo.</w:t>
+            </w:r>
+          </w:p>
+          <w:p>
+            <w:pPr>
+              <w:pStyle w:val="pasantia"/>
+              <w:spacing w:line="360" w:lineRule="auto"/>
+              <w:ind w:firstLine="0"/>
+              <w:jc w:val="both"/>
+              <w:rPr>
+                <w:b/>
+                <w:bCs/>
+                <w:sz w:val="16"/>
+                <w:szCs w:val="16"/>
+              </w:rPr>
+            </w:pPr>
+            <w:r>
+              <w:rPr>
+                <w:b/>
+                <w:bCs/>
+                <w:sz w:val="16"/>
+                <w:szCs w:val="16"/>
+              </w:rPr>
+              <w:t>Emmanuel S</w:t>
+            </w:r>
+            <w:r>
+              <w:rPr>
+                <w:b/>
+                <w:bCs/>
+                <w:sz w:val="16"/>
+                <w:szCs w:val="16"/>
+              </w:rPr>
+              <w:t>á</w:t>
+            </w:r>
+            <w:r>
+              <w:rPr>
+                <w:b/>
+                <w:bCs/>
+                <w:sz w:val="16"/>
+                <w:szCs w:val="16"/>
+              </w:rPr>
+              <w:t>nchez.</w:t>
+            </w:r>
+          </w:p>
+          <w:p>
+            <w:pPr>
+              <w:pStyle w:val="pasantia"/>
+              <w:spacing w:line="360" w:lineRule="auto"/>
+              <w:ind w:firstLine="0"/>
+              <w:jc w:val="both"/>
+              <w:rPr>
+                <w:b/>
+                <w:bCs/>
+                <w:sz w:val="16"/>
+                <w:szCs w:val="16"/>
+              </w:rPr>
+            </w:pPr>
+            <w:r>
+              <w:rPr>
+                <w:b/>
+                <w:bCs/>
+                <w:sz w:val="16"/>
+                <w:szCs w:val="16"/>
+              </w:rPr>
+              <w:t>Aníbal</w:t>
+            </w:r>
+            <w:r>
+              <w:rPr>
+                <w:b/>
+                <w:bCs/>
+                <w:sz w:val="16"/>
+                <w:szCs w:val="16"/>
+              </w:rPr>
+              <w:t xml:space="preserve"> Morillo</w:t>
+            </w:r>
+            <w:r>
+              <w:rPr>
+                <w:b/>
+                <w:bCs/>
+                <w:sz w:val="16"/>
+                <w:szCs w:val="16"/>
+              </w:rPr>
+              <w:t>.</w:t>
+            </w:r>
+          </w:p>
+          <w:p>
+            <w:pPr>
+              <w:pStyle w:val="pasantia"/>
+              <w:spacing w:line="360" w:lineRule="auto"/>
+              <w:ind w:firstLine="0"/>
+              <w:jc w:val="both"/>
+              <w:rPr>
+                <w:b/>
+                <w:bCs/>
+                <w:sz w:val="16"/>
+                <w:szCs w:val="16"/>
+              </w:rPr>
+            </w:pPr>
+            <w:r>
+              <w:rPr>
+                <w:b/>
+                <w:bCs/>
+                <w:sz w:val="16"/>
+                <w:szCs w:val="16"/>
+              </w:rPr>
+              <w:t>Eleazar Uzc</w:t>
+            </w:r>
+            <w:r>
+              <w:rPr>
+                <w:b/>
+                <w:bCs/>
+                <w:sz w:val="16"/>
+                <w:szCs w:val="16"/>
+              </w:rPr>
+              <w:t>á</w:t>
+            </w:r>
+            <w:r>
+              <w:rPr>
+                <w:b/>
+                <w:bCs/>
+                <w:sz w:val="16"/>
+                <w:szCs w:val="16"/>
+              </w:rPr>
+              <w:t>tegu</w:t>
+            </w:r>
+            <w:r>
+              <w:rPr>
+                <w:b/>
+                <w:bCs/>
+                <w:sz w:val="16"/>
+                <w:szCs w:val="16"/>
+              </w:rPr>
+              <w:t>i</w:t>
+            </w:r>
+            <w:r>
+              <w:rPr>
+                <w:b/>
+                <w:bCs/>
+                <w:sz w:val="16"/>
+                <w:szCs w:val="16"/>
+              </w:rPr>
+              <w:t>.</w:t>
             </w:r>
           </w:p>
         </w:tc>
@@ -4663,7 +4734,6 @@
                 <w:bCs/>
                 <w:sz w:val="16"/>
                 <w:szCs w:val="16"/>
-                <w:lang w:val="es-VE"/>
               </w:rPr>
             </w:pPr>
             <w:r>
@@ -4673,26 +4743,26 @@
                 <w:sz w:val="16"/>
                 <w:szCs w:val="16"/>
               </w:rPr>
-              <w:t>Armado de cables de red (ponchado) y verificación de puntos de internet en las oficinas.</w:t>
+              <w:t>Familiarización con las herramientas y equipos de trabajo</w:t>
             </w:r>
           </w:p>
         </w:tc>
         <w:tc>
           <w:tcPr>
             <w:tcW w:w="1621" w:type="dxa"/>
+            <w:vAlign w:val="center"/>
           </w:tcPr>
           <w:p>
             <w:pPr>
               <w:pStyle w:val="pasantia"/>
               <w:spacing w:line="360" w:lineRule="auto"/>
               <w:ind w:firstLine="0"/>
-              <w:jc w:val="both"/>
-              <w:rPr>
-                <w:b/>
-                <w:bCs/>
-                <w:sz w:val="16"/>
-                <w:szCs w:val="16"/>
-                <w:lang w:val="es-VE"/>
+              <w:jc w:val="center"/>
+              <w:rPr>
+                <w:b/>
+                <w:bCs/>
+                <w:sz w:val="16"/>
+                <w:szCs w:val="16"/>
               </w:rPr>
             </w:pPr>
             <w:r>
@@ -4702,26 +4772,26 @@
                 <w:sz w:val="16"/>
                 <w:szCs w:val="16"/>
               </w:rPr>
-              <w:t>25/05/2026</w:t>
+              <w:t>04/05</w:t>
             </w:r>
           </w:p>
         </w:tc>
         <w:tc>
           <w:tcPr>
             <w:tcW w:w="1648" w:type="dxa"/>
+            <w:vAlign w:val="center"/>
           </w:tcPr>
           <w:p>
             <w:pPr>
               <w:pStyle w:val="pasantia"/>
               <w:spacing w:line="360" w:lineRule="auto"/>
               <w:ind w:firstLine="0"/>
-              <w:jc w:val="both"/>
-              <w:rPr>
-                <w:b/>
-                <w:bCs/>
-                <w:sz w:val="16"/>
-                <w:szCs w:val="16"/>
-                <w:lang w:val="es-VE"/>
+              <w:jc w:val="center"/>
+              <w:rPr>
+                <w:b/>
+                <w:bCs/>
+                <w:sz w:val="16"/>
+                <w:szCs w:val="16"/>
               </w:rPr>
             </w:pPr>
             <w:r>
@@ -4731,7 +4801,7 @@
                 <w:sz w:val="16"/>
                 <w:szCs w:val="16"/>
               </w:rPr>
-              <w:t>12/06/2026</w:t>
+              <w:t>06/05</w:t>
             </w:r>
           </w:p>
         </w:tc>
@@ -4743,78 +4813,6 @@
             <w:pPr>
               <w:pStyle w:val="pasantia"/>
               <w:spacing w:line="360" w:lineRule="auto"/>
-              <w:jc w:val="both"/>
-              <w:rPr>
-                <w:b/>
-                <w:bCs/>
-                <w:sz w:val="16"/>
-                <w:szCs w:val="16"/>
-                <w:lang w:val="es-VE"/>
-              </w:rPr>
-            </w:pPr>
-            <w:r>
-              <w:rPr>
-                <w:b/>
-                <w:bCs/>
-                <w:sz w:val="16"/>
-                <w:szCs w:val="16"/>
-                <w:lang w:val="es-VE"/>
-              </w:rPr>
-              <w:t>Metodología: Inspección visual de la ruta del cable y pruebas de continuidad.</w:t>
-            </w:r>
-          </w:p>
-          <w:p>
-            <w:pPr>
-              <w:pStyle w:val="pasantia"/>
-              <w:spacing w:line="360" w:lineRule="auto"/>
-              <w:jc w:val="both"/>
-              <w:rPr>
-                <w:b/>
-                <w:bCs/>
-                <w:sz w:val="16"/>
-                <w:szCs w:val="16"/>
-                <w:lang w:val="es-VE"/>
-              </w:rPr>
-            </w:pPr>
-            <w:r>
-              <w:rPr>
-                <w:b/>
-                <w:bCs/>
-                <w:sz w:val="16"/>
-                <w:szCs w:val="16"/>
-                <w:lang w:val="es-VE"/>
-              </w:rPr>
-              <w:br/>
-            </w:r>
-          </w:p>
-          <w:p>
-            <w:pPr>
-              <w:pStyle w:val="pasantia"/>
-              <w:spacing w:line="360" w:lineRule="auto"/>
-              <w:jc w:val="both"/>
-              <w:rPr>
-                <w:b/>
-                <w:bCs/>
-                <w:sz w:val="16"/>
-                <w:szCs w:val="16"/>
-                <w:lang w:val="es-VE"/>
-              </w:rPr>
-            </w:pPr>
-            <w:r>
-              <w:rPr>
-                <w:b/>
-                <w:bCs/>
-                <w:sz w:val="16"/>
-                <w:szCs w:val="16"/>
-                <w:lang w:val="es-VE"/>
-              </w:rPr>
-              <w:t>Herramientas: Conectores RJ45, cable UTP, pinza ponchadora, probador de cables (Tester).</w:t>
-            </w:r>
-          </w:p>
-          <w:p>
-            <w:pPr>
-              <w:pStyle w:val="pasantia"/>
-              <w:spacing w:line="360" w:lineRule="auto"/>
               <w:ind w:firstLine="0"/>
               <w:jc w:val="both"/>
               <w:rPr>
@@ -4825,6 +4823,66 @@
                 <w:lang w:val="es-VE"/>
               </w:rPr>
             </w:pPr>
+            <w:r>
+              <w:rPr>
+                <w:b/>
+                <w:bCs/>
+                <w:sz w:val="16"/>
+                <w:szCs w:val="16"/>
+                <w:lang w:val="es-VE"/>
+              </w:rPr>
+              <w:t>Se detalla</w:t>
+            </w:r>
+            <w:r>
+              <w:rPr>
+                <w:b/>
+                <w:bCs/>
+                <w:sz w:val="16"/>
+                <w:szCs w:val="16"/>
+                <w:lang w:val="es-VE"/>
+              </w:rPr>
+              <w:t xml:space="preserve"> </w:t>
+            </w:r>
+            <w:r>
+              <w:rPr>
+                <w:b/>
+                <w:bCs/>
+                <w:sz w:val="16"/>
+                <w:szCs w:val="16"/>
+                <w:lang w:val="es-VE"/>
+              </w:rPr>
+              <w:t>el funcionamiento de las herramien</w:t>
+            </w:r>
+            <w:r>
+              <w:rPr>
+                <w:b/>
+                <w:bCs/>
+                <w:sz w:val="16"/>
+                <w:szCs w:val="16"/>
+                <w:lang w:val="es-VE"/>
+              </w:rPr>
+              <w:t>tas y equipos usados en las instalaciones</w:t>
+            </w:r>
+            <w:r>
+              <w:rPr>
+                <w:b/>
+                <w:bCs/>
+                <w:sz w:val="16"/>
+                <w:szCs w:val="16"/>
+                <w:lang w:val="es-VE"/>
+              </w:rPr>
+              <w:t>.</w:t>
+            </w:r>
+            <w:r>
+              <w:rPr>
+                <w:b/>
+                <w:bCs/>
+                <w:sz w:val="16"/>
+                <w:szCs w:val="16"/>
+                <w:lang w:val="es-VE"/>
+              </w:rPr>
+              <w:t xml:space="preserve"> </w:t>
+            </w:r>
           </w:p>
         </w:tc>
         <w:tc>
@@ -4842,7 +4900,6 @@
                 <w:bCs/>
                 <w:sz w:val="16"/>
                 <w:szCs w:val="16"/>
-                <w:lang w:val="es-VE"/>
               </w:rPr>
             </w:pPr>
             <w:r>
@@ -4852,27 +4909,1106 @@
                 <w:sz w:val="16"/>
                 <w:szCs w:val="16"/>
               </w:rPr>
-              <w:t>Tutor Industrial (</w:t>
-            </w:r>
-            <w:proofErr w:type="gramStart"/>
-            <w:r>
-              <w:rPr>
-                <w:b/>
-                <w:bCs/>
-                <w:sz w:val="16"/>
-                <w:szCs w:val="16"/>
-              </w:rPr>
-              <w:t>Jefe</w:t>
-            </w:r>
-            <w:proofErr w:type="gramEnd"/>
-            <w:r>
-              <w:rPr>
-                <w:b/>
-                <w:bCs/>
-                <w:sz w:val="16"/>
-                <w:szCs w:val="16"/>
-              </w:rPr>
-              <w:t xml:space="preserve"> de TI) / Tutor Académico.</w:t>
+              <w:t>Jorge Araujo.</w:t>
+            </w:r>
+          </w:p>
+          <w:p>
+            <w:pPr>
+              <w:pStyle w:val="pasantia"/>
+              <w:spacing w:line="360" w:lineRule="auto"/>
+              <w:ind w:firstLine="0"/>
+              <w:jc w:val="both"/>
+              <w:rPr>
+                <w:b/>
+                <w:bCs/>
+                <w:sz w:val="16"/>
+                <w:szCs w:val="16"/>
+              </w:rPr>
+            </w:pPr>
+            <w:r>
+              <w:rPr>
+                <w:b/>
+                <w:bCs/>
+                <w:sz w:val="16"/>
+                <w:szCs w:val="16"/>
+              </w:rPr>
+              <w:t>Emmanuel S</w:t>
+            </w:r>
+            <w:r>
+              <w:rPr>
+                <w:b/>
+                <w:bCs/>
+                <w:sz w:val="16"/>
+                <w:szCs w:val="16"/>
+              </w:rPr>
+              <w:t>á</w:t>
+            </w:r>
+            <w:r>
+              <w:rPr>
+                <w:b/>
+                <w:bCs/>
+                <w:sz w:val="16"/>
+                <w:szCs w:val="16"/>
+              </w:rPr>
+              <w:t>nchez.</w:t>
+            </w:r>
+          </w:p>
+          <w:p>
+            <w:pPr>
+              <w:pStyle w:val="pasantia"/>
+              <w:spacing w:line="360" w:lineRule="auto"/>
+              <w:ind w:firstLine="0"/>
+              <w:jc w:val="both"/>
+              <w:rPr>
+                <w:b/>
+                <w:bCs/>
+                <w:sz w:val="16"/>
+                <w:szCs w:val="16"/>
+              </w:rPr>
+            </w:pPr>
+            <w:r>
+              <w:rPr>
+                <w:b/>
+                <w:bCs/>
+                <w:sz w:val="16"/>
+                <w:szCs w:val="16"/>
+              </w:rPr>
+              <w:t>Aníbal</w:t>
+            </w:r>
+            <w:r>
+              <w:rPr>
+                <w:b/>
+                <w:bCs/>
+                <w:sz w:val="16"/>
+                <w:szCs w:val="16"/>
+              </w:rPr>
+              <w:t xml:space="preserve"> Morillo</w:t>
+            </w:r>
+            <w:r>
+              <w:rPr>
+                <w:b/>
+                <w:bCs/>
+                <w:sz w:val="16"/>
+                <w:szCs w:val="16"/>
+              </w:rPr>
+              <w:t>.</w:t>
+            </w:r>
+          </w:p>
+          <w:p>
+            <w:pPr>
+              <w:pStyle w:val="pasantia"/>
+              <w:spacing w:line="360" w:lineRule="auto"/>
+              <w:ind w:firstLine="0"/>
+              <w:jc w:val="both"/>
+              <w:rPr>
+                <w:b/>
+                <w:bCs/>
+                <w:sz w:val="16"/>
+                <w:szCs w:val="16"/>
+              </w:rPr>
+            </w:pPr>
+            <w:r>
+              <w:rPr>
+                <w:b/>
+                <w:bCs/>
+                <w:sz w:val="16"/>
+                <w:szCs w:val="16"/>
+              </w:rPr>
+              <w:t>Eleazar Uzc</w:t>
+            </w:r>
+            <w:r>
+              <w:rPr>
+                <w:b/>
+                <w:bCs/>
+                <w:sz w:val="16"/>
+                <w:szCs w:val="16"/>
+              </w:rPr>
+              <w:t>á</w:t>
+            </w:r>
+            <w:r>
+              <w:rPr>
+                <w:b/>
+                <w:bCs/>
+                <w:sz w:val="16"/>
+                <w:szCs w:val="16"/>
+              </w:rPr>
+              <w:t>tegu</w:t>
+            </w:r>
+            <w:r>
+              <w:rPr>
+                <w:b/>
+                <w:bCs/>
+                <w:sz w:val="16"/>
+                <w:szCs w:val="16"/>
+              </w:rPr>
+              <w:t>i</w:t>
+            </w:r>
+            <w:r>
+              <w:rPr>
+                <w:b/>
+                <w:bCs/>
+                <w:sz w:val="16"/>
+                <w:szCs w:val="16"/>
+              </w:rPr>
+              <w:t>.</w:t>
+            </w:r>
+          </w:p>
+        </w:tc>
+      </w:tr>
+      <w:tr>
+        <w:tc>
+          <w:tcPr>
+            <w:tcW w:w="1634" w:type="dxa"/>
+          </w:tcPr>
+          <w:p>
+            <w:pPr>
+              <w:pStyle w:val="pasantia"/>
+              <w:spacing w:line="360" w:lineRule="auto"/>
+              <w:ind w:firstLine="0"/>
+              <w:jc w:val="both"/>
+              <w:rPr>
+                <w:b/>
+                <w:bCs/>
+                <w:sz w:val="16"/>
+                <w:szCs w:val="16"/>
+                <w:lang w:val="es-VE"/>
+              </w:rPr>
+            </w:pPr>
+            <w:r>
+              <w:rPr>
+                <w:b/>
+                <w:bCs/>
+                <w:sz w:val="16"/>
+                <w:szCs w:val="16"/>
+              </w:rPr>
+              <w:t>Instalación de sistemas operativos</w:t>
+            </w:r>
+            <w:r>
+              <w:rPr>
+                <w:b/>
+                <w:bCs/>
+                <w:sz w:val="16"/>
+                <w:szCs w:val="16"/>
+              </w:rPr>
+              <w:t xml:space="preserve"> y </w:t>
+            </w:r>
+            <w:r>
+              <w:rPr>
+                <w:b/>
+                <w:bCs/>
+                <w:sz w:val="16"/>
+                <w:szCs w:val="16"/>
+              </w:rPr>
+              <w:t>programas de oficina.</w:t>
+            </w:r>
+          </w:p>
+        </w:tc>
+        <w:tc>
+          <w:tcPr>
+            <w:tcW w:w="1621" w:type="dxa"/>
+            <w:vAlign w:val="center"/>
+          </w:tcPr>
+          <w:p>
+            <w:pPr>
+              <w:pStyle w:val="pasantia"/>
+              <w:spacing w:line="360" w:lineRule="auto"/>
+              <w:ind w:firstLine="0"/>
+              <w:jc w:val="center"/>
+              <w:rPr>
+                <w:b/>
+                <w:bCs/>
+                <w:sz w:val="16"/>
+                <w:szCs w:val="16"/>
+                <w:lang w:val="es-VE"/>
+              </w:rPr>
+            </w:pPr>
+          </w:p>
+        </w:tc>
+        <w:tc>
+          <w:tcPr>
+            <w:tcW w:w="1648" w:type="dxa"/>
+            <w:vAlign w:val="center"/>
+          </w:tcPr>
+          <w:p>
+            <w:pPr>
+              <w:pStyle w:val="pasantia"/>
+              <w:spacing w:line="360" w:lineRule="auto"/>
+              <w:ind w:firstLine="0"/>
+              <w:jc w:val="center"/>
+              <w:rPr>
+                <w:b/>
+                <w:bCs/>
+                <w:sz w:val="16"/>
+                <w:szCs w:val="16"/>
+                <w:lang w:val="es-VE"/>
+              </w:rPr>
+            </w:pPr>
+          </w:p>
+        </w:tc>
+        <w:tc>
+          <w:tcPr>
+            <w:tcW w:w="1652" w:type="dxa"/>
+          </w:tcPr>
+          <w:p>
+            <w:pPr>
+              <w:pStyle w:val="pasantia"/>
+              <w:spacing w:line="360" w:lineRule="auto"/>
+              <w:ind w:firstLine="0"/>
+              <w:jc w:val="both"/>
+              <w:rPr>
+                <w:b/>
+                <w:bCs/>
+                <w:sz w:val="16"/>
+                <w:szCs w:val="16"/>
+                <w:lang w:val="es-VE"/>
+              </w:rPr>
+            </w:pPr>
+            <w:r>
+              <w:rPr>
+                <w:b/>
+                <w:bCs/>
+                <w:sz w:val="16"/>
+                <w:szCs w:val="16"/>
+                <w:lang w:val="es-VE"/>
+              </w:rPr>
+              <w:t>Revisión directa por equipo e instalación mediante instaladores estándar.</w:t>
+            </w:r>
+          </w:p>
+        </w:tc>
+        <w:tc>
+          <w:tcPr>
+            <w:tcW w:w="1708" w:type="dxa"/>
+          </w:tcPr>
+          <w:p>
+            <w:pPr>
+              <w:pStyle w:val="pasantia"/>
+              <w:spacing w:line="360" w:lineRule="auto"/>
+              <w:ind w:firstLine="0"/>
+              <w:jc w:val="both"/>
+              <w:rPr>
+                <w:b/>
+                <w:bCs/>
+                <w:sz w:val="16"/>
+                <w:szCs w:val="16"/>
+              </w:rPr>
+            </w:pPr>
+            <w:r>
+              <w:rPr>
+                <w:b/>
+                <w:bCs/>
+                <w:sz w:val="16"/>
+                <w:szCs w:val="16"/>
+              </w:rPr>
+              <w:t>Jorge Araujo.</w:t>
+            </w:r>
+          </w:p>
+          <w:p>
+            <w:pPr>
+              <w:pStyle w:val="pasantia"/>
+              <w:spacing w:line="360" w:lineRule="auto"/>
+              <w:ind w:firstLine="0"/>
+              <w:jc w:val="both"/>
+              <w:rPr>
+                <w:b/>
+                <w:bCs/>
+                <w:sz w:val="16"/>
+                <w:szCs w:val="16"/>
+              </w:rPr>
+            </w:pPr>
+            <w:r>
+              <w:rPr>
+                <w:b/>
+                <w:bCs/>
+                <w:sz w:val="16"/>
+                <w:szCs w:val="16"/>
+              </w:rPr>
+              <w:t>Emmanuel S</w:t>
+            </w:r>
+            <w:r>
+              <w:rPr>
+                <w:b/>
+                <w:bCs/>
+                <w:sz w:val="16"/>
+                <w:szCs w:val="16"/>
+              </w:rPr>
+              <w:t>á</w:t>
+            </w:r>
+            <w:r>
+              <w:rPr>
+                <w:b/>
+                <w:bCs/>
+                <w:sz w:val="16"/>
+                <w:szCs w:val="16"/>
+              </w:rPr>
+              <w:t>nchez.</w:t>
+            </w:r>
+          </w:p>
+          <w:p>
+            <w:pPr>
+              <w:pStyle w:val="pasantia"/>
+              <w:spacing w:line="360" w:lineRule="auto"/>
+              <w:ind w:firstLine="0"/>
+              <w:jc w:val="both"/>
+              <w:rPr>
+                <w:b/>
+                <w:bCs/>
+                <w:sz w:val="16"/>
+                <w:szCs w:val="16"/>
+              </w:rPr>
+            </w:pPr>
+            <w:r>
+              <w:rPr>
+                <w:b/>
+                <w:bCs/>
+                <w:sz w:val="16"/>
+                <w:szCs w:val="16"/>
+              </w:rPr>
+              <w:t>Aníbal</w:t>
+            </w:r>
+            <w:r>
+              <w:rPr>
+                <w:b/>
+                <w:bCs/>
+                <w:sz w:val="16"/>
+                <w:szCs w:val="16"/>
+              </w:rPr>
+              <w:t xml:space="preserve"> Morillo</w:t>
+            </w:r>
+            <w:r>
+              <w:rPr>
+                <w:b/>
+                <w:bCs/>
+                <w:sz w:val="16"/>
+                <w:szCs w:val="16"/>
+              </w:rPr>
+              <w:t>.</w:t>
+            </w:r>
+          </w:p>
+          <w:p>
+            <w:pPr>
+              <w:pStyle w:val="pasantia"/>
+              <w:spacing w:line="360" w:lineRule="auto"/>
+              <w:ind w:firstLine="0"/>
+              <w:jc w:val="both"/>
+              <w:rPr>
+                <w:b/>
+                <w:bCs/>
+                <w:sz w:val="16"/>
+                <w:szCs w:val="16"/>
+              </w:rPr>
+            </w:pPr>
+            <w:r>
+              <w:rPr>
+                <w:b/>
+                <w:bCs/>
+                <w:sz w:val="16"/>
+                <w:szCs w:val="16"/>
+              </w:rPr>
+              <w:t>Eleazar Uzc</w:t>
+            </w:r>
+            <w:r>
+              <w:rPr>
+                <w:b/>
+                <w:bCs/>
+                <w:sz w:val="16"/>
+                <w:szCs w:val="16"/>
+              </w:rPr>
+              <w:t>á</w:t>
+            </w:r>
+            <w:r>
+              <w:rPr>
+                <w:b/>
+                <w:bCs/>
+                <w:sz w:val="16"/>
+                <w:szCs w:val="16"/>
+              </w:rPr>
+              <w:t>tegu</w:t>
+            </w:r>
+            <w:r>
+              <w:rPr>
+                <w:b/>
+                <w:bCs/>
+                <w:sz w:val="16"/>
+                <w:szCs w:val="16"/>
+              </w:rPr>
+              <w:t>i</w:t>
+            </w:r>
+            <w:r>
+              <w:rPr>
+                <w:b/>
+                <w:bCs/>
+                <w:sz w:val="16"/>
+                <w:szCs w:val="16"/>
+              </w:rPr>
+              <w:t>.</w:t>
+            </w:r>
+          </w:p>
+        </w:tc>
+      </w:tr>
+      <w:tr>
+        <w:tc>
+          <w:tcPr>
+            <w:tcW w:w="1634" w:type="dxa"/>
+          </w:tcPr>
+          <w:p>
+            <w:pPr>
+              <w:pStyle w:val="pasantia"/>
+              <w:spacing w:line="360" w:lineRule="auto"/>
+              <w:ind w:firstLine="0"/>
+              <w:jc w:val="both"/>
+              <w:rPr>
+                <w:b/>
+                <w:bCs/>
+                <w:sz w:val="16"/>
+                <w:szCs w:val="16"/>
+              </w:rPr>
+            </w:pPr>
+            <w:r>
+              <w:rPr>
+                <w:b/>
+                <w:bCs/>
+                <w:sz w:val="16"/>
+                <w:szCs w:val="16"/>
+              </w:rPr>
+              <w:t>L</w:t>
+            </w:r>
+            <w:r>
+              <w:rPr>
+                <w:b/>
+                <w:bCs/>
+                <w:sz w:val="16"/>
+                <w:szCs w:val="16"/>
+              </w:rPr>
+              <w:t>impieza física de componentes</w:t>
+            </w:r>
+            <w:r>
+              <w:rPr>
+                <w:b/>
+                <w:bCs/>
+                <w:sz w:val="16"/>
+                <w:szCs w:val="16"/>
+              </w:rPr>
+              <w:t xml:space="preserve"> de CPU.</w:t>
+            </w:r>
+          </w:p>
+        </w:tc>
+        <w:tc>
+          <w:tcPr>
+            <w:tcW w:w="1621" w:type="dxa"/>
+            <w:vAlign w:val="center"/>
+          </w:tcPr>
+          <w:p>
+            <w:pPr>
+              <w:pStyle w:val="pasantia"/>
+              <w:spacing w:line="360" w:lineRule="auto"/>
+              <w:ind w:firstLine="0"/>
+              <w:jc w:val="center"/>
+              <w:rPr>
+                <w:b/>
+                <w:bCs/>
+                <w:sz w:val="16"/>
+                <w:szCs w:val="16"/>
+                <w:lang w:val="es-VE"/>
+              </w:rPr>
+            </w:pPr>
+          </w:p>
+        </w:tc>
+        <w:tc>
+          <w:tcPr>
+            <w:tcW w:w="1648" w:type="dxa"/>
+            <w:vAlign w:val="center"/>
+          </w:tcPr>
+          <w:p>
+            <w:pPr>
+              <w:pStyle w:val="pasantia"/>
+              <w:spacing w:line="360" w:lineRule="auto"/>
+              <w:ind w:firstLine="0"/>
+              <w:jc w:val="center"/>
+              <w:rPr>
+                <w:b/>
+                <w:bCs/>
+                <w:sz w:val="16"/>
+                <w:szCs w:val="16"/>
+                <w:lang w:val="es-VE"/>
+              </w:rPr>
+            </w:pPr>
+          </w:p>
+        </w:tc>
+        <w:tc>
+          <w:tcPr>
+            <w:tcW w:w="1652" w:type="dxa"/>
+          </w:tcPr>
+          <w:p>
+            <w:pPr>
+              <w:pStyle w:val="pasantia"/>
+              <w:spacing w:line="360" w:lineRule="auto"/>
+              <w:ind w:firstLine="0"/>
+              <w:jc w:val="both"/>
+              <w:rPr>
+                <w:b/>
+                <w:bCs/>
+                <w:sz w:val="16"/>
+                <w:szCs w:val="16"/>
+                <w:lang w:val="es-VE"/>
+              </w:rPr>
+            </w:pPr>
+            <w:r>
+              <w:rPr>
+                <w:b/>
+                <w:bCs/>
+                <w:sz w:val="16"/>
+                <w:szCs w:val="16"/>
+                <w:lang w:val="es-VE"/>
+              </w:rPr>
+              <w:t>D</w:t>
+            </w:r>
+            <w:r>
+              <w:rPr>
+                <w:b/>
+                <w:bCs/>
+                <w:sz w:val="16"/>
+                <w:szCs w:val="16"/>
+                <w:lang w:val="es-VE"/>
+              </w:rPr>
+              <w:t>estornilladores, sopladora,</w:t>
+            </w:r>
+          </w:p>
+          <w:p>
+            <w:pPr>
+              <w:pStyle w:val="pasantia"/>
+              <w:spacing w:line="360" w:lineRule="auto"/>
+              <w:ind w:firstLine="0"/>
+              <w:jc w:val="both"/>
+              <w:rPr>
+                <w:b/>
+                <w:bCs/>
+                <w:sz w:val="16"/>
+                <w:szCs w:val="16"/>
+                <w:lang w:val="es-VE"/>
+              </w:rPr>
+            </w:pPr>
+            <w:r>
+              <w:rPr>
+                <w:b/>
+                <w:bCs/>
+                <w:sz w:val="16"/>
+                <w:szCs w:val="16"/>
+                <w:lang w:val="es-VE"/>
+              </w:rPr>
+              <w:t xml:space="preserve">limpiador de contacto, </w:t>
+            </w:r>
+            <w:r>
+              <w:rPr>
+                <w:b/>
+                <w:bCs/>
+                <w:sz w:val="16"/>
+                <w:szCs w:val="16"/>
+                <w:lang w:val="es-VE"/>
+              </w:rPr>
+              <w:t>software básico.</w:t>
+            </w:r>
+          </w:p>
+        </w:tc>
+        <w:tc>
+          <w:tcPr>
+            <w:tcW w:w="1708" w:type="dxa"/>
+          </w:tcPr>
+          <w:p>
+            <w:pPr>
+              <w:pStyle w:val="pasantia"/>
+              <w:spacing w:line="360" w:lineRule="auto"/>
+              <w:ind w:firstLine="0"/>
+              <w:jc w:val="both"/>
+              <w:rPr>
+                <w:b/>
+                <w:bCs/>
+                <w:sz w:val="16"/>
+                <w:szCs w:val="16"/>
+              </w:rPr>
+            </w:pPr>
+            <w:r>
+              <w:rPr>
+                <w:b/>
+                <w:bCs/>
+                <w:sz w:val="16"/>
+                <w:szCs w:val="16"/>
+              </w:rPr>
+              <w:t>Jorge Araujo.</w:t>
+            </w:r>
+          </w:p>
+          <w:p>
+            <w:pPr>
+              <w:pStyle w:val="pasantia"/>
+              <w:spacing w:line="360" w:lineRule="auto"/>
+              <w:ind w:firstLine="0"/>
+              <w:jc w:val="both"/>
+              <w:rPr>
+                <w:b/>
+                <w:bCs/>
+                <w:sz w:val="16"/>
+                <w:szCs w:val="16"/>
+              </w:rPr>
+            </w:pPr>
+            <w:r>
+              <w:rPr>
+                <w:b/>
+                <w:bCs/>
+                <w:sz w:val="16"/>
+                <w:szCs w:val="16"/>
+              </w:rPr>
+              <w:t>Emmanuel S</w:t>
+            </w:r>
+            <w:r>
+              <w:rPr>
+                <w:b/>
+                <w:bCs/>
+                <w:sz w:val="16"/>
+                <w:szCs w:val="16"/>
+              </w:rPr>
+              <w:t>á</w:t>
+            </w:r>
+            <w:r>
+              <w:rPr>
+                <w:b/>
+                <w:bCs/>
+                <w:sz w:val="16"/>
+                <w:szCs w:val="16"/>
+              </w:rPr>
+              <w:t>nchez.</w:t>
+            </w:r>
+          </w:p>
+          <w:p>
+            <w:pPr>
+              <w:pStyle w:val="pasantia"/>
+              <w:spacing w:line="360" w:lineRule="auto"/>
+              <w:ind w:firstLine="0"/>
+              <w:jc w:val="both"/>
+              <w:rPr>
+                <w:b/>
+                <w:bCs/>
+                <w:sz w:val="16"/>
+                <w:szCs w:val="16"/>
+              </w:rPr>
+            </w:pPr>
+            <w:r>
+              <w:rPr>
+                <w:b/>
+                <w:bCs/>
+                <w:sz w:val="16"/>
+                <w:szCs w:val="16"/>
+              </w:rPr>
+              <w:t>Aníbal</w:t>
+            </w:r>
+            <w:r>
+              <w:rPr>
+                <w:b/>
+                <w:bCs/>
+                <w:sz w:val="16"/>
+                <w:szCs w:val="16"/>
+              </w:rPr>
+              <w:t xml:space="preserve"> Morillo</w:t>
+            </w:r>
+            <w:r>
+              <w:rPr>
+                <w:b/>
+                <w:bCs/>
+                <w:sz w:val="16"/>
+                <w:szCs w:val="16"/>
+              </w:rPr>
+              <w:t>.</w:t>
+            </w:r>
+          </w:p>
+          <w:p>
+            <w:pPr>
+              <w:pStyle w:val="pasantia"/>
+              <w:spacing w:line="360" w:lineRule="auto"/>
+              <w:ind w:firstLine="0"/>
+              <w:jc w:val="both"/>
+              <w:rPr>
+                <w:b/>
+                <w:bCs/>
+                <w:sz w:val="16"/>
+                <w:szCs w:val="16"/>
+              </w:rPr>
+            </w:pPr>
+            <w:r>
+              <w:rPr>
+                <w:b/>
+                <w:bCs/>
+                <w:sz w:val="16"/>
+                <w:szCs w:val="16"/>
+              </w:rPr>
+              <w:t>Eleazar Uzc</w:t>
+            </w:r>
+            <w:r>
+              <w:rPr>
+                <w:b/>
+                <w:bCs/>
+                <w:sz w:val="16"/>
+                <w:szCs w:val="16"/>
+              </w:rPr>
+              <w:t>á</w:t>
+            </w:r>
+            <w:r>
+              <w:rPr>
+                <w:b/>
+                <w:bCs/>
+                <w:sz w:val="16"/>
+                <w:szCs w:val="16"/>
+              </w:rPr>
+              <w:t>tegu</w:t>
+            </w:r>
+            <w:r>
+              <w:rPr>
+                <w:b/>
+                <w:bCs/>
+                <w:sz w:val="16"/>
+                <w:szCs w:val="16"/>
+              </w:rPr>
+              <w:t>i</w:t>
+            </w:r>
+            <w:r>
+              <w:rPr>
+                <w:b/>
+                <w:bCs/>
+                <w:sz w:val="16"/>
+                <w:szCs w:val="16"/>
+              </w:rPr>
+              <w:t>.</w:t>
+            </w:r>
+          </w:p>
+        </w:tc>
+      </w:tr>
+      <w:tr>
+        <w:trPr>
+          <w:trHeight w:val="1647"/>
+        </w:trPr>
+        <w:tc>
+          <w:tcPr>
+            <w:tcW w:w="1634" w:type="dxa"/>
+          </w:tcPr>
+          <w:p>
+            <w:pPr>
+              <w:pStyle w:val="pasantia"/>
+              <w:spacing w:line="360" w:lineRule="auto"/>
+              <w:ind w:firstLine="0"/>
+              <w:jc w:val="both"/>
+              <w:rPr>
+                <w:b/>
+                <w:bCs/>
+                <w:sz w:val="16"/>
+                <w:szCs w:val="16"/>
+                <w:lang w:val="es-VE"/>
+              </w:rPr>
+            </w:pPr>
+            <w:r>
+              <w:rPr>
+                <w:b/>
+                <w:bCs/>
+                <w:sz w:val="16"/>
+                <w:szCs w:val="16"/>
+              </w:rPr>
+              <w:t>Armado de cables de red (ponchado).</w:t>
+            </w:r>
+          </w:p>
+        </w:tc>
+        <w:tc>
+          <w:tcPr>
+            <w:tcW w:w="1621" w:type="dxa"/>
+            <w:vAlign w:val="center"/>
+          </w:tcPr>
+          <w:p>
+            <w:pPr>
+              <w:pStyle w:val="pasantia"/>
+              <w:spacing w:line="360" w:lineRule="auto"/>
+              <w:ind w:firstLine="0"/>
+              <w:jc w:val="center"/>
+              <w:rPr>
+                <w:b/>
+                <w:bCs/>
+                <w:sz w:val="16"/>
+                <w:szCs w:val="16"/>
+                <w:lang w:val="es-VE"/>
+              </w:rPr>
+            </w:pPr>
+          </w:p>
+        </w:tc>
+        <w:tc>
+          <w:tcPr>
+            <w:tcW w:w="1648" w:type="dxa"/>
+            <w:vAlign w:val="center"/>
+          </w:tcPr>
+          <w:p>
+            <w:pPr>
+              <w:pStyle w:val="pasantia"/>
+              <w:spacing w:line="360" w:lineRule="auto"/>
+              <w:ind w:firstLine="0"/>
+              <w:jc w:val="center"/>
+              <w:rPr>
+                <w:b/>
+                <w:bCs/>
+                <w:sz w:val="16"/>
+                <w:szCs w:val="16"/>
+                <w:lang w:val="es-VE"/>
+              </w:rPr>
+            </w:pPr>
+          </w:p>
+        </w:tc>
+        <w:tc>
+          <w:tcPr>
+            <w:tcW w:w="1652" w:type="dxa"/>
+          </w:tcPr>
+          <w:p>
+            <w:pPr>
+              <w:pStyle w:val="pasantia"/>
+              <w:spacing w:line="360" w:lineRule="auto"/>
+              <w:ind w:firstLine="0"/>
+              <w:jc w:val="both"/>
+              <w:rPr>
+                <w:b/>
+                <w:bCs/>
+                <w:sz w:val="16"/>
+                <w:szCs w:val="16"/>
+                <w:lang w:val="es-VE"/>
+              </w:rPr>
+            </w:pPr>
+            <w:r>
+              <w:rPr>
+                <w:b/>
+                <w:bCs/>
+                <w:sz w:val="16"/>
+                <w:szCs w:val="16"/>
+                <w:lang w:val="es-VE"/>
+              </w:rPr>
+              <w:t>Inspección visual</w:t>
+            </w:r>
+            <w:r>
+              <w:rPr>
+                <w:b/>
+                <w:bCs/>
+                <w:sz w:val="16"/>
+                <w:szCs w:val="16"/>
+                <w:lang w:val="es-VE"/>
+              </w:rPr>
+              <w:t xml:space="preserve"> </w:t>
+            </w:r>
+            <w:r>
+              <w:rPr>
+                <w:b/>
+                <w:bCs/>
+                <w:sz w:val="16"/>
+                <w:szCs w:val="16"/>
+                <w:lang w:val="es-VE"/>
+              </w:rPr>
+              <w:t>del cable y pruebas de continuidad.</w:t>
+            </w:r>
+          </w:p>
+          <w:p>
+            <w:pPr>
+              <w:pStyle w:val="pasantia"/>
+              <w:spacing w:line="360" w:lineRule="auto"/>
+              <w:jc w:val="both"/>
+              <w:rPr>
+                <w:b/>
+                <w:bCs/>
+                <w:sz w:val="16"/>
+                <w:szCs w:val="16"/>
+                <w:lang w:val="es-VE"/>
+              </w:rPr>
+            </w:pPr>
+          </w:p>
+          <w:p>
+            <w:pPr>
+              <w:pStyle w:val="pasantia"/>
+              <w:spacing w:line="360" w:lineRule="auto"/>
+              <w:ind w:firstLine="0"/>
+              <w:jc w:val="both"/>
+              <w:rPr>
+                <w:b/>
+                <w:bCs/>
+                <w:sz w:val="16"/>
+                <w:szCs w:val="16"/>
+                <w:lang w:val="es-VE"/>
+              </w:rPr>
+            </w:pPr>
+            <w:r>
+              <w:rPr>
+                <w:b/>
+                <w:bCs/>
+                <w:sz w:val="16"/>
+                <w:szCs w:val="16"/>
+                <w:lang w:val="es-VE"/>
+              </w:rPr>
+              <w:t>Conectores RJ45, cable UTP, pinza ponchadora, probador de cables.</w:t>
+            </w:r>
+          </w:p>
+        </w:tc>
+        <w:tc>
+          <w:tcPr>
+            <w:tcW w:w="1708" w:type="dxa"/>
+          </w:tcPr>
+          <w:p>
+            <w:pPr>
+              <w:pStyle w:val="pasantia"/>
+              <w:spacing w:line="360" w:lineRule="auto"/>
+              <w:ind w:firstLine="0"/>
+              <w:jc w:val="both"/>
+              <w:rPr>
+                <w:b/>
+                <w:bCs/>
+                <w:sz w:val="16"/>
+                <w:szCs w:val="16"/>
+              </w:rPr>
+            </w:pPr>
+            <w:r>
+              <w:rPr>
+                <w:b/>
+                <w:bCs/>
+                <w:sz w:val="16"/>
+                <w:szCs w:val="16"/>
+              </w:rPr>
+              <w:t>Jorge Araujo.</w:t>
+            </w:r>
+          </w:p>
+          <w:p>
+            <w:pPr>
+              <w:pStyle w:val="pasantia"/>
+              <w:spacing w:line="360" w:lineRule="auto"/>
+              <w:ind w:firstLine="0"/>
+              <w:jc w:val="both"/>
+              <w:rPr>
+                <w:b/>
+                <w:bCs/>
+                <w:sz w:val="16"/>
+                <w:szCs w:val="16"/>
+              </w:rPr>
+            </w:pPr>
+            <w:r>
+              <w:rPr>
+                <w:b/>
+                <w:bCs/>
+                <w:sz w:val="16"/>
+                <w:szCs w:val="16"/>
+              </w:rPr>
+              <w:t>Emmanuel S</w:t>
+            </w:r>
+            <w:r>
+              <w:rPr>
+                <w:b/>
+                <w:bCs/>
+                <w:sz w:val="16"/>
+                <w:szCs w:val="16"/>
+              </w:rPr>
+              <w:t>á</w:t>
+            </w:r>
+            <w:r>
+              <w:rPr>
+                <w:b/>
+                <w:bCs/>
+                <w:sz w:val="16"/>
+                <w:szCs w:val="16"/>
+              </w:rPr>
+              <w:t>nchez.</w:t>
+            </w:r>
+          </w:p>
+          <w:p>
+            <w:pPr>
+              <w:pStyle w:val="pasantia"/>
+              <w:spacing w:line="360" w:lineRule="auto"/>
+              <w:ind w:firstLine="0"/>
+              <w:jc w:val="both"/>
+              <w:rPr>
+                <w:b/>
+                <w:bCs/>
+                <w:sz w:val="16"/>
+                <w:szCs w:val="16"/>
+              </w:rPr>
+            </w:pPr>
+            <w:r>
+              <w:rPr>
+                <w:b/>
+                <w:bCs/>
+                <w:sz w:val="16"/>
+                <w:szCs w:val="16"/>
+              </w:rPr>
+              <w:t>Aníbal</w:t>
+            </w:r>
+            <w:r>
+              <w:rPr>
+                <w:b/>
+                <w:bCs/>
+                <w:sz w:val="16"/>
+                <w:szCs w:val="16"/>
+              </w:rPr>
+              <w:t xml:space="preserve"> Morillo</w:t>
+            </w:r>
+            <w:r>
+              <w:rPr>
+                <w:b/>
+                <w:bCs/>
+                <w:sz w:val="16"/>
+                <w:szCs w:val="16"/>
+              </w:rPr>
+              <w:t>.</w:t>
+            </w:r>
+          </w:p>
+          <w:p>
+            <w:pPr>
+              <w:pStyle w:val="pasantia"/>
+              <w:spacing w:line="360" w:lineRule="auto"/>
+              <w:ind w:firstLine="0"/>
+              <w:jc w:val="both"/>
+              <w:rPr>
+                <w:b/>
+                <w:bCs/>
+                <w:sz w:val="16"/>
+                <w:szCs w:val="16"/>
+              </w:rPr>
+            </w:pPr>
+            <w:r>
+              <w:rPr>
+                <w:b/>
+                <w:bCs/>
+                <w:sz w:val="16"/>
+                <w:szCs w:val="16"/>
+              </w:rPr>
+              <w:t>Eleazar Uzc</w:t>
+            </w:r>
+            <w:r>
+              <w:rPr>
+                <w:b/>
+                <w:bCs/>
+                <w:sz w:val="16"/>
+                <w:szCs w:val="16"/>
+              </w:rPr>
+              <w:t>á</w:t>
+            </w:r>
+            <w:r>
+              <w:rPr>
+                <w:b/>
+                <w:bCs/>
+                <w:sz w:val="16"/>
+                <w:szCs w:val="16"/>
+              </w:rPr>
+              <w:t>tegu</w:t>
+            </w:r>
+            <w:r>
+              <w:rPr>
+                <w:b/>
+                <w:bCs/>
+                <w:sz w:val="16"/>
+                <w:szCs w:val="16"/>
+              </w:rPr>
+              <w:t>i</w:t>
+            </w:r>
+            <w:r>
+              <w:rPr>
+                <w:b/>
+                <w:bCs/>
+                <w:sz w:val="16"/>
+                <w:szCs w:val="16"/>
+              </w:rPr>
+              <w:t>.</w:t>
             </w:r>
           </w:p>
         </w:tc>
@@ -4904,7 +6040,16 @@
                 <w:sz w:val="16"/>
                 <w:szCs w:val="16"/>
               </w:rPr>
-              <w:t xml:space="preserve">Verificación visual del encendido de los equipos del rack y ejecución </w:t>
+              <w:t>R</w:t>
+            </w:r>
+            <w:r>
+              <w:rPr>
+                <w:b/>
+                <w:bCs/>
+                <w:sz w:val="16"/>
+                <w:szCs w:val="16"/>
+              </w:rPr>
+              <w:t xml:space="preserve">egistro manual de nuevos usuarios en el </w:t>
             </w:r>
             <w:r>
               <w:rPr>
@@ -4914,20 +6059,30 @@
                 <w:szCs w:val="16"/>
               </w:rPr>
               <w:lastRenderedPageBreak/>
-              <w:t>de copias de seguridad (backups) manuales.</w:t>
+              <w:t xml:space="preserve">sensor </w:t>
+            </w:r>
+            <w:r>
+              <w:rPr>
+                <w:b/>
+                <w:bCs/>
+                <w:sz w:val="16"/>
+                <w:szCs w:val="16"/>
+              </w:rPr>
+              <w:t>biométrico.</w:t>
             </w:r>
           </w:p>
         </w:tc>
         <w:tc>
           <w:tcPr>
             <w:tcW w:w="1621" w:type="dxa"/>
+            <w:vAlign w:val="center"/>
           </w:tcPr>
           <w:p>
             <w:pPr>
               <w:pStyle w:val="pasantia"/>
               <w:spacing w:line="360" w:lineRule="auto"/>
               <w:ind w:firstLine="0"/>
-              <w:jc w:val="both"/>
+              <w:jc w:val="center"/>
               <w:rPr>
                 <w:b/>
                 <w:bCs/>
@@ -4936,28 +6091,19 @@
                 <w:lang w:val="es-VE"/>
               </w:rPr>
             </w:pPr>
-            <w:r>
-              <w:rPr>
-                <w:b/>
-                <w:bCs/>
-                <w:sz w:val="16"/>
-                <w:szCs w:val="16"/>
-              </w:rPr>
-              <w:lastRenderedPageBreak/>
-              <w:t>15/06/2026</w:t>
-            </w:r>
           </w:p>
         </w:tc>
         <w:tc>
           <w:tcPr>
             <w:tcW w:w="1648" w:type="dxa"/>
+            <w:vAlign w:val="center"/>
           </w:tcPr>
           <w:p>
             <w:pPr>
               <w:pStyle w:val="pasantia"/>
               <w:spacing w:line="360" w:lineRule="auto"/>
               <w:ind w:firstLine="0"/>
-              <w:jc w:val="both"/>
+              <w:jc w:val="center"/>
               <w:rPr>
                 <w:b/>
                 <w:bCs/>
@@ -4966,15 +6112,6 @@
                 <w:lang w:val="es-VE"/>
               </w:rPr>
             </w:pPr>
-            <w:r>
-              <w:rPr>
-                <w:b/>
-                <w:bCs/>
-                <w:sz w:val="16"/>
-                <w:szCs w:val="16"/>
-              </w:rPr>
-              <w:t>03/07/2026</w:t>
-            </w:r>
           </w:p>
         </w:tc>
         <w:tc>
@@ -4985,6 +6122,7 @@
             <w:pPr>
               <w:pStyle w:val="pasantia"/>
               <w:spacing w:line="360" w:lineRule="auto"/>
+              <w:ind w:firstLine="0"/>
               <w:jc w:val="both"/>
               <w:rPr>
                 <w:b/>
@@ -5002,7 +6140,27 @@
                 <w:szCs w:val="16"/>
                 <w:lang w:val="es-VE"/>
               </w:rPr>
-              <w:t xml:space="preserve">Metodología: Rutina diaria de inspección en el cuarto de </w:t>
+              <w:t>C</w:t>
+            </w:r>
+            <w:r>
+              <w:rPr>
+                <w:b/>
+                <w:bCs/>
+                <w:sz w:val="16"/>
+                <w:szCs w:val="16"/>
+                <w:lang w:val="es-VE"/>
+              </w:rPr>
+              <w:t>arga de datos en el software de control de</w:t>
+            </w:r>
+            <w:r>
+              <w:rPr>
+                <w:b/>
+                <w:bCs/>
+                <w:sz w:val="16"/>
+                <w:szCs w:val="16"/>
+                <w:lang w:val="es-VE"/>
+              </w:rPr>
+              <w:t xml:space="preserve"> </w:t>
             </w:r>
             <w:r>
               <w:rPr>
@@ -5013,22 +6171,18 @@
                 <w:lang w:val="es-VE"/>
               </w:rPr>
               <w:lastRenderedPageBreak/>
-              <w:t>servidores y copia de archivos en discos externos.</w:t>
-            </w:r>
-          </w:p>
-          <w:p>
-            <w:pPr>
-              <w:pStyle w:val="pasantia"/>
-              <w:spacing w:line="360" w:lineRule="auto"/>
-              <w:jc w:val="both"/>
-              <w:rPr>
-                <w:b/>
-                <w:bCs/>
-                <w:sz w:val="16"/>
-                <w:szCs w:val="16"/>
-                <w:lang w:val="es-VE"/>
-              </w:rPr>
-            </w:pPr>
+              <w:t>usuarios</w:t>
+            </w:r>
+            <w:r>
+              <w:rPr>
+                <w:b/>
+                <w:bCs/>
+                <w:sz w:val="16"/>
+                <w:szCs w:val="16"/>
+                <w:lang w:val="es-VE"/>
+              </w:rPr>
+              <w:t>.</w:t>
+            </w:r>
             <w:r>
               <w:rPr>
                 <w:b/>
@@ -5038,30 +6192,6 @@
                 <w:lang w:val="es-VE"/>
               </w:rPr>
               <w:br/>
-            </w:r>
-          </w:p>
-          <w:p>
-            <w:pPr>
-              <w:pStyle w:val="pasantia"/>
-              <w:spacing w:line="360" w:lineRule="auto"/>
-              <w:jc w:val="both"/>
-              <w:rPr>
-                <w:b/>
-                <w:bCs/>
-                <w:sz w:val="16"/>
-                <w:szCs w:val="16"/>
-                <w:lang w:val="es-VE"/>
-              </w:rPr>
-            </w:pPr>
-            <w:r>
-              <w:rPr>
-                <w:b/>
-                <w:bCs/>
-                <w:sz w:val="16"/>
-                <w:szCs w:val="16"/>
-                <w:lang w:val="es-VE"/>
-              </w:rPr>
-              <w:t>Herramientas: Discos duros externos, interfaz gráfica del servidor.</w:t>
             </w:r>
           </w:p>
           <w:p>
@@ -5078,6 +6208,26 @@
                 <w:lang w:val="es-VE"/>
               </w:rPr>
             </w:pPr>
+            <w:r>
+              <w:rPr>
+                <w:b/>
+                <w:bCs/>
+                <w:sz w:val="16"/>
+                <w:szCs w:val="16"/>
+                <w:lang w:val="es-VE"/>
+              </w:rPr>
+              <w:t>S</w:t>
+            </w:r>
+            <w:r>
+              <w:rPr>
+                <w:b/>
+                <w:bCs/>
+                <w:sz w:val="16"/>
+                <w:szCs w:val="16"/>
+                <w:lang w:val="es-VE"/>
+              </w:rPr>
+              <w:t>oftware del sistema biométrico.</w:t>
+            </w:r>
           </w:p>
         </w:tc>
         <w:tc>
@@ -5095,7 +6245,6 @@
                 <w:bCs/>
                 <w:sz w:val="16"/>
                 <w:szCs w:val="16"/>
-                <w:lang w:val="es-VE"/>
               </w:rPr>
             </w:pPr>
             <w:r>
@@ -5106,27 +6255,149 @@
                 <w:szCs w:val="16"/>
               </w:rPr>
               <w:lastRenderedPageBreak/>
-              <w:t>Tutor Industrial (</w:t>
-            </w:r>
-            <w:proofErr w:type="gramStart"/>
-            <w:r>
-              <w:rPr>
-                <w:b/>
-                <w:bCs/>
-                <w:sz w:val="16"/>
-                <w:szCs w:val="16"/>
-              </w:rPr>
-              <w:t>Jefe</w:t>
-            </w:r>
-            <w:proofErr w:type="gramEnd"/>
-            <w:r>
-              <w:rPr>
-                <w:b/>
-                <w:bCs/>
-                <w:sz w:val="16"/>
-                <w:szCs w:val="16"/>
-              </w:rPr>
-              <w:t xml:space="preserve"> de TI) / Tutor Académico.</w:t>
+              <w:t>Jorge Araujo.</w:t>
+            </w:r>
+          </w:p>
+          <w:p>
+            <w:pPr>
+              <w:pStyle w:val="pasantia"/>
+              <w:spacing w:line="360" w:lineRule="auto"/>
+              <w:ind w:firstLine="0"/>
+              <w:jc w:val="both"/>
+              <w:rPr>
+                <w:b/>
+                <w:bCs/>
+                <w:sz w:val="16"/>
+                <w:szCs w:val="16"/>
+              </w:rPr>
+            </w:pPr>
+            <w:r>
+              <w:rPr>
+                <w:b/>
+                <w:bCs/>
+                <w:sz w:val="16"/>
+                <w:szCs w:val="16"/>
+              </w:rPr>
+              <w:t>Emmanuel S</w:t>
+            </w:r>
+            <w:r>
+              <w:rPr>
+                <w:b/>
+                <w:bCs/>
+                <w:sz w:val="16"/>
+                <w:szCs w:val="16"/>
+              </w:rPr>
+              <w:t>á</w:t>
+            </w:r>
+            <w:r>
+              <w:rPr>
+                <w:b/>
+                <w:bCs/>
+                <w:sz w:val="16"/>
+                <w:szCs w:val="16"/>
+              </w:rPr>
+              <w:t>nchez.</w:t>
+            </w:r>
+          </w:p>
+          <w:p>
+            <w:pPr>
+              <w:pStyle w:val="pasantia"/>
+              <w:spacing w:line="360" w:lineRule="auto"/>
+              <w:ind w:firstLine="0"/>
+              <w:jc w:val="both"/>
+              <w:rPr>
+                <w:b/>
+                <w:bCs/>
+                <w:sz w:val="16"/>
+                <w:szCs w:val="16"/>
+              </w:rPr>
+            </w:pPr>
+            <w:r>
+              <w:rPr>
+                <w:b/>
+                <w:bCs/>
+                <w:sz w:val="16"/>
+                <w:szCs w:val="16"/>
+              </w:rPr>
+              <w:lastRenderedPageBreak/>
+              <w:t>Aníbal</w:t>
+            </w:r>
+            <w:r>
+              <w:rPr>
+                <w:b/>
+                <w:bCs/>
+                <w:sz w:val="16"/>
+                <w:szCs w:val="16"/>
+              </w:rPr>
+              <w:t xml:space="preserve"> Morillo</w:t>
+            </w:r>
+            <w:r>
+              <w:rPr>
+                <w:b/>
+                <w:bCs/>
+                <w:sz w:val="16"/>
+                <w:szCs w:val="16"/>
+              </w:rPr>
+              <w:t>.</w:t>
+            </w:r>
+          </w:p>
+          <w:p>
+            <w:pPr>
+              <w:pStyle w:val="pasantia"/>
+              <w:spacing w:line="360" w:lineRule="auto"/>
+              <w:ind w:firstLine="0"/>
+              <w:jc w:val="both"/>
+              <w:rPr>
+                <w:b/>
+                <w:bCs/>
+                <w:sz w:val="16"/>
+                <w:szCs w:val="16"/>
+              </w:rPr>
+            </w:pPr>
+            <w:r>
+              <w:rPr>
+                <w:b/>
+                <w:bCs/>
+                <w:sz w:val="16"/>
+                <w:szCs w:val="16"/>
+              </w:rPr>
+              <w:t>Eleazar Uzc</w:t>
+            </w:r>
+            <w:r>
+              <w:rPr>
+                <w:b/>
+                <w:bCs/>
+                <w:sz w:val="16"/>
+                <w:szCs w:val="16"/>
+              </w:rPr>
+              <w:t>á</w:t>
+            </w:r>
+            <w:r>
+              <w:rPr>
+                <w:b/>
+                <w:bCs/>
+                <w:sz w:val="16"/>
+                <w:szCs w:val="16"/>
+              </w:rPr>
+              <w:t>tegu</w:t>
+            </w:r>
+            <w:r>
+              <w:rPr>
+                <w:b/>
+                <w:bCs/>
+                <w:sz w:val="16"/>
+                <w:szCs w:val="16"/>
+              </w:rPr>
+              <w:t>i</w:t>
+            </w:r>
+            <w:r>
+              <w:rPr>
+                <w:b/>
+                <w:bCs/>
+                <w:sz w:val="16"/>
+                <w:szCs w:val="16"/>
+              </w:rPr>
+              <w:t>.</w:t>
             </w:r>
           </w:p>
         </w:tc>
@@ -5158,20 +6429,21 @@
                 <w:sz w:val="16"/>
                 <w:szCs w:val="16"/>
               </w:rPr>
-              <w:t>Limpieza física de lentes de cámaras de seguridad y registro manual de nuevos usuarios en el reloj biométrico.</w:t>
+              <w:t xml:space="preserve">Configuración de impresión en red </w:t>
             </w:r>
           </w:p>
         </w:tc>
         <w:tc>
           <w:tcPr>
             <w:tcW w:w="1621" w:type="dxa"/>
+            <w:vAlign w:val="center"/>
           </w:tcPr>
           <w:p>
             <w:pPr>
               <w:pStyle w:val="pasantia"/>
               <w:spacing w:line="360" w:lineRule="auto"/>
               <w:ind w:firstLine="0"/>
-              <w:jc w:val="both"/>
+              <w:jc w:val="center"/>
               <w:rPr>
                 <w:b/>
                 <w:bCs/>
@@ -5180,27 +6452,19 @@
                 <w:lang w:val="es-VE"/>
               </w:rPr>
             </w:pPr>
-            <w:r>
-              <w:rPr>
-                <w:b/>
-                <w:bCs/>
-                <w:sz w:val="16"/>
-                <w:szCs w:val="16"/>
-              </w:rPr>
-              <w:t>06/07/2026</w:t>
-            </w:r>
           </w:p>
         </w:tc>
         <w:tc>
           <w:tcPr>
             <w:tcW w:w="1648" w:type="dxa"/>
+            <w:vAlign w:val="center"/>
           </w:tcPr>
           <w:p>
             <w:pPr>
               <w:pStyle w:val="pasantia"/>
               <w:spacing w:line="360" w:lineRule="auto"/>
               <w:ind w:firstLine="0"/>
-              <w:jc w:val="both"/>
+              <w:jc w:val="center"/>
               <w:rPr>
                 <w:b/>
                 <w:bCs/>
@@ -5209,26 +6473,18 @@
                 <w:lang w:val="es-VE"/>
               </w:rPr>
             </w:pPr>
-            <w:r>
-              <w:rPr>
-                <w:b/>
-                <w:bCs/>
-                <w:sz w:val="16"/>
-                <w:szCs w:val="16"/>
-              </w:rPr>
-              <w:t>24/07/2026</w:t>
-            </w:r>
           </w:p>
         </w:tc>
         <w:tc>
           <w:tcPr>
             <w:tcW w:w="1652" w:type="dxa"/>
+            <w:vAlign w:val="center"/>
           </w:tcPr>
           <w:p>
             <w:pPr>
               <w:pStyle w:val="pasantia"/>
               <w:spacing w:line="360" w:lineRule="auto"/>
-              <w:jc w:val="both"/>
+              <w:ind w:firstLine="0"/>
               <w:rPr>
                 <w:b/>
                 <w:bCs/>
@@ -5245,22 +6501,8 @@
                 <w:szCs w:val="16"/>
                 <w:lang w:val="es-VE"/>
               </w:rPr>
-              <w:t>Metodología: Limpieza manual de hardware y carga de datos en el software de control de asistencia.</w:t>
-            </w:r>
-          </w:p>
-          <w:p>
-            <w:pPr>
-              <w:pStyle w:val="pasantia"/>
-              <w:spacing w:line="360" w:lineRule="auto"/>
-              <w:jc w:val="both"/>
-              <w:rPr>
-                <w:b/>
-                <w:bCs/>
-                <w:sz w:val="16"/>
-                <w:szCs w:val="16"/>
-                <w:lang w:val="es-VE"/>
-              </w:rPr>
-            </w:pPr>
+              <w:t xml:space="preserve">Pruebas de impresión locales </w:t>
+            </w:r>
             <w:r>
               <w:rPr>
                 <w:b/>
@@ -5270,30 +6512,6 @@
                 <w:lang w:val="es-VE"/>
               </w:rPr>
               <w:br/>
-            </w:r>
-          </w:p>
-          <w:p>
-            <w:pPr>
-              <w:pStyle w:val="pasantia"/>
-              <w:spacing w:line="360" w:lineRule="auto"/>
-              <w:jc w:val="both"/>
-              <w:rPr>
-                <w:b/>
-                <w:bCs/>
-                <w:sz w:val="16"/>
-                <w:szCs w:val="16"/>
-                <w:lang w:val="es-VE"/>
-              </w:rPr>
-            </w:pPr>
-            <w:r>
-              <w:rPr>
-                <w:b/>
-                <w:bCs/>
-                <w:sz w:val="16"/>
-                <w:szCs w:val="16"/>
-                <w:lang w:val="es-VE"/>
-              </w:rPr>
-              <w:t>Herramientas: Paños de microfibra, escaleras, software del sistema biométrico.</w:t>
             </w:r>
           </w:p>
           <w:p>
@@ -5301,7 +6519,6 @@
               <w:pStyle w:val="pasantia"/>
               <w:spacing w:line="360" w:lineRule="auto"/>
               <w:ind w:firstLine="0"/>
-              <w:jc w:val="both"/>
               <w:rPr>
                 <w:b/>
                 <w:bCs/>
@@ -5310,6 +6527,16 @@
                 <w:lang w:val="es-VE"/>
               </w:rPr>
             </w:pPr>
+            <w:r>
+              <w:rPr>
+                <w:b/>
+                <w:bCs/>
+                <w:sz w:val="16"/>
+                <w:szCs w:val="16"/>
+                <w:lang w:val="es-VE"/>
+              </w:rPr>
+              <w:t>Drivers oficiales.</w:t>
+            </w:r>
           </w:p>
         </w:tc>
         <w:tc>
@@ -5327,7 +6554,6 @@
                 <w:bCs/>
                 <w:sz w:val="16"/>
                 <w:szCs w:val="16"/>
-                <w:lang w:val="es-VE"/>
               </w:rPr>
             </w:pPr>
             <w:r>
@@ -5337,27 +6563,148 @@
                 <w:sz w:val="16"/>
                 <w:szCs w:val="16"/>
               </w:rPr>
-              <w:t>Tutor Industrial (</w:t>
-            </w:r>
-            <w:proofErr w:type="gramStart"/>
-            <w:r>
-              <w:rPr>
-                <w:b/>
-                <w:bCs/>
-                <w:sz w:val="16"/>
-                <w:szCs w:val="16"/>
-              </w:rPr>
-              <w:t>Jefe</w:t>
-            </w:r>
-            <w:proofErr w:type="gramEnd"/>
-            <w:r>
-              <w:rPr>
-                <w:b/>
-                <w:bCs/>
-                <w:sz w:val="16"/>
-                <w:szCs w:val="16"/>
-              </w:rPr>
-              <w:t xml:space="preserve"> de TI) / Tutor Académico.</w:t>
+              <w:t>Jorge Araujo.</w:t>
+            </w:r>
+          </w:p>
+          <w:p>
+            <w:pPr>
+              <w:pStyle w:val="pasantia"/>
+              <w:spacing w:line="360" w:lineRule="auto"/>
+              <w:ind w:firstLine="0"/>
+              <w:jc w:val="both"/>
+              <w:rPr>
+                <w:b/>
+                <w:bCs/>
+                <w:sz w:val="16"/>
+                <w:szCs w:val="16"/>
+              </w:rPr>
+            </w:pPr>
+            <w:r>
+              <w:rPr>
+                <w:b/>
+                <w:bCs/>
+                <w:sz w:val="16"/>
+                <w:szCs w:val="16"/>
+              </w:rPr>
+              <w:t>Emmanuel S</w:t>
+            </w:r>
+            <w:r>
+              <w:rPr>
+                <w:b/>
+                <w:bCs/>
+                <w:sz w:val="16"/>
+                <w:szCs w:val="16"/>
+              </w:rPr>
+              <w:t>á</w:t>
+            </w:r>
+            <w:r>
+              <w:rPr>
+                <w:b/>
+                <w:bCs/>
+                <w:sz w:val="16"/>
+                <w:szCs w:val="16"/>
+              </w:rPr>
+              <w:t>nchez.</w:t>
+            </w:r>
+          </w:p>
+          <w:p>
+            <w:pPr>
+              <w:pStyle w:val="pasantia"/>
+              <w:spacing w:line="360" w:lineRule="auto"/>
+              <w:ind w:firstLine="0"/>
+              <w:jc w:val="both"/>
+              <w:rPr>
+                <w:b/>
+                <w:bCs/>
+                <w:sz w:val="16"/>
+                <w:szCs w:val="16"/>
+              </w:rPr>
+            </w:pPr>
+            <w:r>
+              <w:rPr>
+                <w:b/>
+                <w:bCs/>
+                <w:sz w:val="16"/>
+                <w:szCs w:val="16"/>
+              </w:rPr>
+              <w:t>Aníbal</w:t>
+            </w:r>
+            <w:r>
+              <w:rPr>
+                <w:b/>
+                <w:bCs/>
+                <w:sz w:val="16"/>
+                <w:szCs w:val="16"/>
+              </w:rPr>
+              <w:t xml:space="preserve"> Morillo</w:t>
+            </w:r>
+            <w:r>
+              <w:rPr>
+                <w:b/>
+                <w:bCs/>
+                <w:sz w:val="16"/>
+                <w:szCs w:val="16"/>
+              </w:rPr>
+              <w:t>.</w:t>
+            </w:r>
+          </w:p>
+          <w:p>
+            <w:pPr>
+              <w:pStyle w:val="pasantia"/>
+              <w:spacing w:line="360" w:lineRule="auto"/>
+              <w:ind w:firstLine="0"/>
+              <w:jc w:val="both"/>
+              <w:rPr>
+                <w:b/>
+                <w:bCs/>
+                <w:sz w:val="16"/>
+                <w:szCs w:val="16"/>
+              </w:rPr>
+            </w:pPr>
+            <w:r>
+              <w:rPr>
+                <w:b/>
+                <w:bCs/>
+                <w:sz w:val="16"/>
+                <w:szCs w:val="16"/>
+              </w:rPr>
+              <w:t>Eleazar Uzc</w:t>
+            </w:r>
+            <w:r>
+              <w:rPr>
+                <w:b/>
+                <w:bCs/>
+                <w:sz w:val="16"/>
+                <w:szCs w:val="16"/>
+              </w:rPr>
+              <w:t>á</w:t>
+            </w:r>
+            <w:r>
+              <w:rPr>
+                <w:b/>
+                <w:bCs/>
+                <w:sz w:val="16"/>
+                <w:szCs w:val="16"/>
+              </w:rPr>
+              <w:t>tegu</w:t>
+            </w:r>
+            <w:r>
+              <w:rPr>
+                <w:b/>
+                <w:bCs/>
+                <w:sz w:val="16"/>
+                <w:szCs w:val="16"/>
+              </w:rPr>
+              <w:t>i</w:t>
+            </w:r>
+            <w:r>
+              <w:rPr>
+                <w:b/>
+                <w:bCs/>
+                <w:sz w:val="16"/>
+                <w:szCs w:val="16"/>
+              </w:rPr>
+              <w:t>.</w:t>
             </w:r>
           </w:p>
         </w:tc>
@@ -5379,7 +6726,6 @@
                 <w:bCs/>
                 <w:sz w:val="16"/>
                 <w:szCs w:val="16"/>
-                <w:lang w:val="es-VE"/>
               </w:rPr>
             </w:pPr>
             <w:r>
@@ -5389,20 +6735,30 @@
                 <w:sz w:val="16"/>
                 <w:szCs w:val="16"/>
               </w:rPr>
-              <w:t>Configuración de equipos de impresión en red, cambio de cartuchos/tóner y solución de atascos de papel.</w:t>
+              <w:t>C</w:t>
+            </w:r>
+            <w:r>
+              <w:rPr>
+                <w:b/>
+                <w:bCs/>
+                <w:sz w:val="16"/>
+                <w:szCs w:val="16"/>
+              </w:rPr>
+              <w:t>ambio de cartuchos/tóner y solución de atascos de papel.</w:t>
             </w:r>
           </w:p>
         </w:tc>
         <w:tc>
           <w:tcPr>
             <w:tcW w:w="1621" w:type="dxa"/>
+            <w:vAlign w:val="center"/>
           </w:tcPr>
           <w:p>
             <w:pPr>
               <w:pStyle w:val="pasantia"/>
               <w:spacing w:line="360" w:lineRule="auto"/>
               <w:ind w:firstLine="0"/>
-              <w:jc w:val="both"/>
+              <w:jc w:val="center"/>
               <w:rPr>
                 <w:b/>
                 <w:bCs/>
@@ -5411,27 +6767,19 @@
                 <w:lang w:val="es-VE"/>
               </w:rPr>
             </w:pPr>
-            <w:r>
-              <w:rPr>
-                <w:b/>
-                <w:bCs/>
-                <w:sz w:val="16"/>
-                <w:szCs w:val="16"/>
-              </w:rPr>
-              <w:t>27/07/2026</w:t>
-            </w:r>
           </w:p>
         </w:tc>
         <w:tc>
           <w:tcPr>
             <w:tcW w:w="1648" w:type="dxa"/>
+            <w:vAlign w:val="center"/>
           </w:tcPr>
           <w:p>
             <w:pPr>
               <w:pStyle w:val="pasantia"/>
               <w:spacing w:line="360" w:lineRule="auto"/>
               <w:ind w:firstLine="0"/>
-              <w:jc w:val="both"/>
+              <w:jc w:val="center"/>
               <w:rPr>
                 <w:b/>
                 <w:bCs/>
@@ -5440,15 +6788,6 @@
                 <w:lang w:val="es-VE"/>
               </w:rPr>
             </w:pPr>
-            <w:r>
-              <w:rPr>
-                <w:b/>
-                <w:bCs/>
-                <w:sz w:val="16"/>
-                <w:szCs w:val="16"/>
-              </w:rPr>
-              <w:t>07/08/2026</w:t>
-            </w:r>
           </w:p>
         </w:tc>
         <w:tc>
@@ -5459,6 +6798,7 @@
             <w:pPr>
               <w:pStyle w:val="pasantia"/>
               <w:spacing w:line="360" w:lineRule="auto"/>
+              <w:ind w:firstLine="0"/>
               <w:jc w:val="both"/>
               <w:rPr>
                 <w:b/>
@@ -5476,55 +6816,17 @@
                 <w:szCs w:val="16"/>
                 <w:lang w:val="es-VE"/>
               </w:rPr>
-              <w:t>Metodología: Pruebas de impresión locales y reemplazo directo de consumibles agotados.</w:t>
-            </w:r>
-          </w:p>
-          <w:p>
-            <w:pPr>
-              <w:pStyle w:val="pasantia"/>
-              <w:spacing w:line="360" w:lineRule="auto"/>
-              <w:jc w:val="both"/>
-              <w:rPr>
-                <w:b/>
-                <w:bCs/>
-                <w:sz w:val="16"/>
-                <w:szCs w:val="16"/>
-                <w:lang w:val="es-VE"/>
-              </w:rPr>
-            </w:pPr>
-            <w:r>
-              <w:rPr>
-                <w:b/>
-                <w:bCs/>
-                <w:sz w:val="16"/>
-                <w:szCs w:val="16"/>
-                <w:lang w:val="es-VE"/>
-              </w:rPr>
-              <w:br/>
-            </w:r>
-          </w:p>
-          <w:p>
-            <w:pPr>
-              <w:pStyle w:val="pasantia"/>
-              <w:spacing w:line="360" w:lineRule="auto"/>
-              <w:jc w:val="both"/>
-              <w:rPr>
-                <w:b/>
-                <w:bCs/>
-                <w:sz w:val="16"/>
-                <w:szCs w:val="16"/>
-                <w:lang w:val="es-VE"/>
-              </w:rPr>
-            </w:pPr>
-            <w:r>
-              <w:rPr>
-                <w:b/>
-                <w:bCs/>
-                <w:sz w:val="16"/>
-                <w:szCs w:val="16"/>
-                <w:lang w:val="es-VE"/>
-              </w:rPr>
-              <w:t>Herramientas: Drivers oficiales, tóners de repuesto, herramientas manuales básicas.</w:t>
+              <w:t>R</w:t>
+            </w:r>
+            <w:r>
+              <w:rPr>
+                <w:b/>
+                <w:bCs/>
+                <w:sz w:val="16"/>
+                <w:szCs w:val="16"/>
+                <w:lang w:val="es-VE"/>
+              </w:rPr>
+              <w:t>eemplazo directo de consumibles agotados.</w:t>
             </w:r>
           </w:p>
           <w:p>
@@ -5541,6 +6843,53 @@
                 <w:lang w:val="es-VE"/>
               </w:rPr>
             </w:pPr>
+          </w:p>
+          <w:p>
+            <w:pPr>
+              <w:pStyle w:val="pasantia"/>
+              <w:spacing w:line="360" w:lineRule="auto"/>
+              <w:ind w:firstLine="0"/>
+              <w:jc w:val="both"/>
+              <w:rPr>
+                <w:b/>
+                <w:bCs/>
+                <w:sz w:val="16"/>
+                <w:szCs w:val="16"/>
+                <w:lang w:val="es-VE"/>
+              </w:rPr>
+            </w:pPr>
+            <w:proofErr w:type="spellStart"/>
+            <w:r>
+              <w:rPr>
+                <w:b/>
+                <w:bCs/>
+                <w:sz w:val="16"/>
+                <w:szCs w:val="16"/>
+                <w:lang w:val="es-VE"/>
+              </w:rPr>
+              <w:t>T</w:t>
+            </w:r>
+            <w:r>
+              <w:rPr>
+                <w:b/>
+                <w:bCs/>
+                <w:sz w:val="16"/>
+                <w:szCs w:val="16"/>
+                <w:lang w:val="es-VE"/>
+              </w:rPr>
+              <w:t>óners</w:t>
+            </w:r>
+            <w:proofErr w:type="spellEnd"/>
+            <w:r>
+              <w:rPr>
+                <w:b/>
+                <w:bCs/>
+                <w:sz w:val="16"/>
+                <w:szCs w:val="16"/>
+                <w:lang w:val="es-VE"/>
+              </w:rPr>
+              <w:t xml:space="preserve"> de repuesto,</w:t>
+            </w:r>
           </w:p>
         </w:tc>
         <w:tc>
@@ -5558,7 +6907,6 @@
                 <w:bCs/>
                 <w:sz w:val="16"/>
                 <w:szCs w:val="16"/>
-                <w:lang w:val="es-VE"/>
               </w:rPr>
             </w:pPr>
             <w:r>
@@ -5568,7 +6916,148 @@
                 <w:sz w:val="16"/>
                 <w:szCs w:val="16"/>
               </w:rPr>
-              <w:t>Tutor Industrial (Jefe de TI) / Tutor Académico.</w:t>
+              <w:t>Jorge Araujo.</w:t>
+            </w:r>
+          </w:p>
+          <w:p>
+            <w:pPr>
+              <w:pStyle w:val="pasantia"/>
+              <w:spacing w:line="360" w:lineRule="auto"/>
+              <w:ind w:firstLine="0"/>
+              <w:jc w:val="both"/>
+              <w:rPr>
+                <w:b/>
+                <w:bCs/>
+                <w:sz w:val="16"/>
+                <w:szCs w:val="16"/>
+              </w:rPr>
+            </w:pPr>
+            <w:r>
+              <w:rPr>
+                <w:b/>
+                <w:bCs/>
+                <w:sz w:val="16"/>
+                <w:szCs w:val="16"/>
+              </w:rPr>
+              <w:t>Emmanuel S</w:t>
+            </w:r>
+            <w:r>
+              <w:rPr>
+                <w:b/>
+                <w:bCs/>
+                <w:sz w:val="16"/>
+                <w:szCs w:val="16"/>
+              </w:rPr>
+              <w:t>á</w:t>
+            </w:r>
+            <w:r>
+              <w:rPr>
+                <w:b/>
+                <w:bCs/>
+                <w:sz w:val="16"/>
+                <w:szCs w:val="16"/>
+              </w:rPr>
+              <w:t>nchez.</w:t>
+            </w:r>
+          </w:p>
+          <w:p>
+            <w:pPr>
+              <w:pStyle w:val="pasantia"/>
+              <w:spacing w:line="360" w:lineRule="auto"/>
+              <w:ind w:firstLine="0"/>
+              <w:jc w:val="both"/>
+              <w:rPr>
+                <w:b/>
+                <w:bCs/>
+                <w:sz w:val="16"/>
+                <w:szCs w:val="16"/>
+              </w:rPr>
+            </w:pPr>
+            <w:r>
+              <w:rPr>
+                <w:b/>
+                <w:bCs/>
+                <w:sz w:val="16"/>
+                <w:szCs w:val="16"/>
+              </w:rPr>
+              <w:t>Aníbal</w:t>
+            </w:r>
+            <w:r>
+              <w:rPr>
+                <w:b/>
+                <w:bCs/>
+                <w:sz w:val="16"/>
+                <w:szCs w:val="16"/>
+              </w:rPr>
+              <w:t xml:space="preserve"> Morillo</w:t>
+            </w:r>
+            <w:r>
+              <w:rPr>
+                <w:b/>
+                <w:bCs/>
+                <w:sz w:val="16"/>
+                <w:szCs w:val="16"/>
+              </w:rPr>
+              <w:t>.</w:t>
+            </w:r>
+          </w:p>
+          <w:p>
+            <w:pPr>
+              <w:pStyle w:val="pasantia"/>
+              <w:spacing w:line="360" w:lineRule="auto"/>
+              <w:ind w:firstLine="0"/>
+              <w:jc w:val="both"/>
+              <w:rPr>
+                <w:b/>
+                <w:bCs/>
+                <w:sz w:val="16"/>
+                <w:szCs w:val="16"/>
+              </w:rPr>
+            </w:pPr>
+            <w:r>
+              <w:rPr>
+                <w:b/>
+                <w:bCs/>
+                <w:sz w:val="16"/>
+                <w:szCs w:val="16"/>
+              </w:rPr>
+              <w:t>Eleazar Uzc</w:t>
+            </w:r>
+            <w:r>
+              <w:rPr>
+                <w:b/>
+                <w:bCs/>
+                <w:sz w:val="16"/>
+                <w:szCs w:val="16"/>
+              </w:rPr>
+              <w:t>á</w:t>
+            </w:r>
+            <w:r>
+              <w:rPr>
+                <w:b/>
+                <w:bCs/>
+                <w:sz w:val="16"/>
+                <w:szCs w:val="16"/>
+              </w:rPr>
+              <w:t>tegu</w:t>
+            </w:r>
+            <w:r>
+              <w:rPr>
+                <w:b/>
+                <w:bCs/>
+                <w:sz w:val="16"/>
+                <w:szCs w:val="16"/>
+              </w:rPr>
+              <w:t>i</w:t>
+            </w:r>
+            <w:r>
+              <w:rPr>
+                <w:b/>
+                <w:bCs/>
+                <w:sz w:val="16"/>
+                <w:szCs w:val="16"/>
+              </w:rPr>
+              <w:t>.</w:t>
             </w:r>
           </w:p>
         </w:tc>
@@ -5579,12 +7068,358 @@
         <w:pStyle w:val="pasantia"/>
         <w:spacing w:line="480" w:lineRule="auto"/>
         <w:ind w:firstLine="0"/>
-        <w:rPr>
-          <w:b/>
-          <w:bCs/>
-          <w:lang w:val="es-VE"/>
-        </w:rPr>
-      </w:pPr>
+        <w:jc w:val="both"/>
+        <w:rPr>
+          <w:b/>
+          <w:bCs/>
+          <w:lang w:val="es-VE"/>
+        </w:rPr>
+      </w:pPr>
+      <w:r>
+        <w:rPr>
+          <w:b/>
+          <w:bCs/>
+          <w:lang w:val="es-VE"/>
+        </w:rPr>
+        <w:t>Fuentes: Araujo (2026)</w:t>
+      </w:r>
+    </w:p>
+    <w:p>
+      <w:pPr>
+        <w:pStyle w:val="pasantia"/>
+        <w:spacing w:line="480" w:lineRule="auto"/>
+        <w:ind w:firstLine="0"/>
+        <w:rPr>
+          <w:b/>
+          <w:bCs/>
+          <w:lang w:val="es-VE"/>
+        </w:rPr>
+      </w:pPr>
+    </w:p>
+    <w:p>
+      <w:pPr>
+        <w:pStyle w:val="Tesis"/>
+        <w:spacing w:after="160" w:line="240" w:lineRule="auto"/>
+        <w:ind w:firstLine="0"/>
+        <w:rPr>
+          <w:sz w:val="20"/>
+          <w:szCs w:val="20"/>
+        </w:rPr>
+      </w:pPr>
+      <w:r>
+        <w:rPr>
+          <w:noProof/>
+          <w:sz w:val="20"/>
+          <w:szCs w:val="20"/>
+        </w:rPr>
+        <mc:AlternateContent>
+          <mc:Choice Requires="wps">
+            <w:drawing>
+              <wp:anchor distT="0" distB="0" distL="114300" distR="114300" simplePos="0" relativeHeight="251664384" behindDoc="0" locked="0" layoutInCell="1" allowOverlap="1" wp14:anchorId="10379C2D" wp14:editId="406F132F">
+                <wp:simplePos x="0" y="0"/>
+                <wp:positionH relativeFrom="margin">
+                  <wp:align>right</wp:align>
+                </wp:positionH>
+                <wp:positionV relativeFrom="paragraph">
+                  <wp:posOffset>157312</wp:posOffset>
+                </wp:positionV>
+                <wp:extent cx="2263775" cy="0"/>
+                <wp:effectExtent l="0" t="0" r="0" b="0"/>
+                <wp:wrapNone/>
+                <wp:docPr id="980963653" name="Conector recto 1"/>
+                <wp:cNvGraphicFramePr/>
+                <a:graphic xmlns:a="http://schemas.openxmlformats.org/drawingml/2006/main">
+                  <a:graphicData uri="http://schemas.microsoft.com/office/word/2010/wordprocessingShape">
+                    <wps:wsp>
+                      <wps:cNvCnPr/>
+                      <wps:spPr>
+                        <a:xfrm flipV="1">
+                          <a:off x="0" y="0"/>
+                          <a:ext cx="2263775" cy="0"/>
+                        </a:xfrm>
+                        <a:prstGeom prst="line">
+                          <a:avLst/>
+                        </a:prstGeom>
+                      </wps:spPr>
+                      <wps:style>
+                        <a:lnRef idx="1">
+                          <a:schemeClr val="dk1"/>
+                        </a:lnRef>
+                        <a:fillRef idx="0">
+                          <a:schemeClr val="dk1"/>
+                        </a:fillRef>
+                        <a:effectRef idx="0">
+                          <a:schemeClr val="dk1"/>
+                        </a:effectRef>
+                        <a:fontRef idx="minor">
+                          <a:schemeClr val="tx1"/>
+                        </a:fontRef>
+                      </wps:style>
+                      <wps:bodyPr/>
+                    </wps:wsp>
+                  </a:graphicData>
+                </a:graphic>
+                <wp14:sizeRelH relativeFrom="margin">
+                  <wp14:pctWidth>0</wp14:pctWidth>
+                </wp14:sizeRelH>
+                <wp14:sizeRelV relativeFrom="margin">
+                  <wp14:pctHeight>0</wp14:pctHeight>
+                </wp14:sizeRelV>
+              </wp:anchor>
+            </w:drawing>
+          </mc:Choice>
+          <mc:Fallback>
+            <w:pict>
+              <v:line w14:anchorId="12CDCB0F" id="Conector recto 1" o:spid="_x0000_s1026" style="position:absolute;flip:y;z-index:251664384;visibility:visible;mso-wrap-style:square;mso-width-percent:0;mso-height-percent:0;mso-wrap-distance-left:9pt;mso-wrap-distance-top:0;mso-wrap-distance-right:9pt;mso-wrap-distance-bottom:0;mso-position-horizontal:right;mso-position-horizontal-relative:margin;mso-position-vertical:absolute;mso-position-vertical-relative:text;mso-width-percent:0;mso-height-percent:0;mso-width-relative:margin;mso-height-relative:margin" from="127.05pt,12.4pt" to="305.3pt,12.4pt" o:gfxdata="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" strokecolor="black [3200]" strokeweight=".5pt">
+                <v:stroke joinstyle="miter"/>
+                <w10:wrap anchorx="margin"/>
+              </v:line>
+            </w:pict>
+          </mc:Fallback>
+        </mc:AlternateContent>
+      </w:r>
+      <w:r>
+        <w:rPr>
+          <w:noProof/>
+          <w:sz w:val="20"/>
+          <w:szCs w:val="20"/>
+        </w:rPr>
+        <mc:AlternateContent>
+          <mc:Choice Requires="wps">
+            <w:drawing>
+              <wp:anchor distT="0" distB="0" distL="114300" distR="114300" simplePos="0" relativeHeight="251663360" behindDoc="0" locked="0" layoutInCell="1" allowOverlap="1" wp14:anchorId="003FCBB1" wp14:editId="2A760212">
+                <wp:simplePos x="0" y="0"/>
+                <wp:positionH relativeFrom="margin">
+                  <wp:align>left</wp:align>
+                </wp:positionH>
+                <wp:positionV relativeFrom="paragraph">
+                  <wp:posOffset>157480</wp:posOffset>
+                </wp:positionV>
+                <wp:extent cx="2264400" cy="0"/>
+                <wp:effectExtent l="0" t="0" r="0" b="0"/>
+                <wp:wrapNone/>
+                <wp:docPr id="138732434" name="Conector recto 1"/>
+                <wp:cNvGraphicFramePr/>
+                <a:graphic xmlns:a="http://schemas.openxmlformats.org/drawingml/2006/main">
+                  <a:graphicData uri="http://schemas.microsoft.com/office/word/2010/wordprocessingShape">
+                    <wps:wsp>
+                      <wps:cNvCnPr/>
+                      <wps:spPr>
+                        <a:xfrm>
+                          <a:off x="0" y="0"/>
+                          <a:ext cx="2264400" cy="0"/>
+                        </a:xfrm>
+                        <a:prstGeom prst="line">
+                          <a:avLst/>
+                        </a:prstGeom>
+                      </wps:spPr>
+                      <wps:style>
+                        <a:lnRef idx="1">
+                          <a:schemeClr val="dk1"/>
+                        </a:lnRef>
+                        <a:fillRef idx="0">
+                          <a:schemeClr val="dk1"/>
+                        </a:fillRef>
+                        <a:effectRef idx="0">
+                          <a:schemeClr val="dk1"/>
+                        </a:effectRef>
+                        <a:fontRef idx="minor">
+                          <a:schemeClr val="tx1"/>
+                        </a:fontRef>
+                      </wps:style>
+                      <wps:bodyPr/>
+                    </wps:wsp>
+                  </a:graphicData>
+                </a:graphic>
+                <wp14:sizeRelH relativeFrom="margin">
+                  <wp14:pctWidth>0</wp14:pctWidth>
+                </wp14:sizeRelH>
+                <wp14:sizeRelV relativeFrom="margin">
+                  <wp14:pctHeight>0</wp14:pctHeight>
+                </wp14:sizeRelV>
+              </wp:anchor>
+            </w:drawing>
+          </mc:Choice>
+          <mc:Fallback>
+            <w:pict>
+              <v:line w14:anchorId="280B0C20" id="Conector recto 1" o:spid="_x0000_s1026" style="position:absolute;z-index:251663360;visibility:visible;mso-wrap-style:square;mso-width-percent:0;mso-height-percent:0;mso-wrap-distance-left:9pt;mso-wrap-distance-top:0;mso-wrap-distance-right:9pt;mso-wrap-distance-bottom:0;mso-position-horizontal:left;mso-position-horizontal-relative:margin;mso-position-vertical:absolute;mso-position-vertical-relative:text;mso-width-percent:0;mso-height-percent:0;mso-width-relative:margin;mso-height-relative:margin" from="0,12.4pt" to="178.3pt,12.4pt" o:gfxdata="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" strokecolor="black [3200]" strokeweight=".5pt">
+                <v:stroke joinstyle="miter"/>
+                <w10:wrap anchorx="margin"/>
+              </v:line>
+            </w:pict>
+          </mc:Fallback>
+        </mc:AlternateContent>
+      </w:r>
+    </w:p>
+    <w:p>
+      <w:pPr>
+        <w:pStyle w:val="pasantia"/>
+        <w:tabs>
+          <w:tab w:val="left" w:pos="6331"/>
+          <w:tab w:val="right" w:pos="8273"/>
+        </w:tabs>
+        <w:spacing w:after="0" w:line="240" w:lineRule="auto"/>
+        <w:ind w:firstLine="0"/>
+        <w:jc w:val="center"/>
+        <w:rPr>
+          <w:lang w:val="es-VE"/>
+        </w:rPr>
+      </w:pPr>
+      <w:r>
+        <w:rPr>
+          <w:lang w:val="es-VE"/>
+        </w:rPr>
+        <w:t>Tutor</w:t>
+      </w:r>
+      <w:r>
+        <w:rPr>
+          <w:lang w:val="es-VE"/>
+        </w:rPr>
+        <w:t xml:space="preserve"> Empresarial</w:t>
+      </w:r>
+      <w:r>
+        <w:rPr>
+          <w:lang w:val="es-VE"/>
+        </w:rPr>
+        <w:t xml:space="preserve">          </w:t>
+      </w:r>
+      <w:r>
+        <w:rPr>
+          <w:lang w:val="es-VE"/>
+        </w:rPr>
+        <w:t xml:space="preserve">  </w:t>
+      </w:r>
+      <w:r>
+        <w:rPr>
+          <w:lang w:val="es-VE"/>
+        </w:rPr>
+        <w:t xml:space="preserve">                        </w:t>
+      </w:r>
+      <w:r>
+        <w:rPr>
+          <w:lang w:val="es-VE"/>
+        </w:rPr>
+        <w:t xml:space="preserve">    </w:t>
+      </w:r>
+      <w:r>
+        <w:rPr>
+          <w:lang w:val="es-VE"/>
+        </w:rPr>
+        <w:t xml:space="preserve">         Tutor Académico</w:t>
+      </w:r>
+    </w:p>
+    <w:p>
+      <w:pPr>
+        <w:pStyle w:val="pasantia"/>
+        <w:tabs>
+          <w:tab w:val="left" w:pos="6331"/>
+          <w:tab w:val="right" w:pos="8273"/>
+        </w:tabs>
+        <w:spacing w:after="0" w:line="240" w:lineRule="auto"/>
+        <w:ind w:firstLine="0"/>
+        <w:jc w:val="center"/>
+        <w:rPr>
+          <w:lang w:val="es-VE"/>
+        </w:rPr>
+      </w:pPr>
+      <w:r>
+        <w:rPr>
+          <w:lang w:val="es-VE"/>
+        </w:rPr>
+        <w:t>Ing. Emmanuel Sánchez</w:t>
+      </w:r>
+      <w:r>
+        <w:rPr>
+          <w:lang w:val="es-VE"/>
+        </w:rPr>
+        <w:t xml:space="preserve">                       </w:t>
+      </w:r>
+      <w:r>
+        <w:rPr>
+          <w:lang w:val="es-VE"/>
+        </w:rPr>
+        <w:t xml:space="preserve">    </w:t>
+      </w:r>
+      <w:r>
+        <w:rPr>
+          <w:lang w:val="es-VE"/>
+        </w:rPr>
+        <w:t xml:space="preserve"> </w:t>
+      </w:r>
+      <w:r>
+        <w:rPr>
+          <w:lang w:val="es-VE"/>
+        </w:rPr>
+        <w:t xml:space="preserve">  </w:t>
+      </w:r>
+      <w:r>
+        <w:rPr>
+          <w:lang w:val="es-VE"/>
+        </w:rPr>
+        <w:t xml:space="preserve">          Prof. Omar González</w:t>
+      </w:r>
+    </w:p>
+    <w:p>
+      <w:pPr>
+        <w:pStyle w:val="pasantia"/>
+        <w:tabs>
+          <w:tab w:val="left" w:pos="6331"/>
+          <w:tab w:val="right" w:pos="8273"/>
+        </w:tabs>
+        <w:spacing w:after="0" w:line="360" w:lineRule="auto"/>
+        <w:ind w:firstLine="0"/>
+        <w:rPr>
+          <w:lang w:val="es-VE"/>
+        </w:rPr>
+      </w:pPr>
+    </w:p>
+    <w:p>
+      <w:pPr>
+        <w:pStyle w:val="pasantia"/>
+        <w:tabs>
+          <w:tab w:val="left" w:pos="6331"/>
+          <w:tab w:val="right" w:pos="8273"/>
+        </w:tabs>
+        <w:spacing w:after="0" w:line="360" w:lineRule="auto"/>
+        <w:ind w:firstLine="0"/>
+        <w:rPr>
+          <w:lang w:val="es-VE"/>
+        </w:rPr>
+      </w:pPr>
+    </w:p>
+    <w:p>
+      <w:pPr>
+        <w:pStyle w:val="pasantia"/>
+        <w:tabs>
+          <w:tab w:val="left" w:pos="6331"/>
+          <w:tab w:val="right" w:pos="8273"/>
+        </w:tabs>
+        <w:spacing w:after="0" w:line="360" w:lineRule="auto"/>
+        <w:ind w:firstLine="0"/>
+        <w:rPr>
+          <w:lang w:val="es-VE"/>
+        </w:rPr>
+      </w:pPr>
+    </w:p>
+    <w:p>
+      <w:pPr>
+        <w:pStyle w:val="pasantia"/>
+        <w:tabs>
+          <w:tab w:val="left" w:pos="6331"/>
+          <w:tab w:val="right" w:pos="8273"/>
+        </w:tabs>
+        <w:spacing w:after="0" w:line="360" w:lineRule="auto"/>
+        <w:ind w:firstLine="0"/>
+        <w:rPr>
+          <w:lang w:val="es-VE"/>
+        </w:rPr>
+      </w:pPr>
+      <w:r>
+        <w:rPr>
+          <w:lang w:val="es-VE"/>
+        </w:rPr>
+        <w:t>Sello de la Empresa o Institución</w:t>
+      </w:r>
     </w:p>
     <w:sectPr>
       <w:pgSz w:w="12242" w:h="15842" w:code="1"/>
@@ -5597,7 +7432,7 @@
 </file>
 
 <file path=word/endnotes.xml><?xml version="1.0" encoding="utf-8"?>
-<w:endnotes xmlns:wpc="http://schemas.microsoft.com/office/word/2010/wordprocessingCanvas" xmlns:cx="http://schemas.microsoft.com/office/drawing/2014/chartex" xmlns:cx1="http://schemas.microsoft.com/office/drawing/2015/9/8/chartex" xmlns:cx2="http://schemas.microsoft.com/office/drawing/2015/10/21/chartex" xmlns:cx3="http://schemas.microsoft.com/office/drawing/2016/5/9/chartex" xmlns:cx4="http://schemas.microsoft.com/office/drawing/2016/5/10/chartex" xmlns:cx5="http://schemas.microsoft.com/office/drawing/2016/5/11/chartex" xmlns:cx6="http://schemas.microsoft.com/office/drawing/2016/5/12/chartex" xmlns:cx7="http://schemas.microsoft.com/office/drawing/2016/5/13/chartex" xmlns:cx8="http://schemas.microsoft.com/office/drawing/2016/5/14/chartex" xmlns:mc="http://schemas.openxmlformats.org/markup-compatibility/2006" xmlns:aink="http://schemas.microsoft.com/office/drawing/2016/ink" xmlns:am3d="http://schemas.microsoft.com/office/drawing/2017/model3d" xmlns:o="urn:schemas-microsoft-com:office:office" xmlns:oel="http://schemas.microsoft.com/office/2019/extlst" xmlns:r="http://schemas.openxmlformats.org/officeDocument/2006/relationships" xmlns:m="http://schemas.openxmlformats.org/officeDocument/2006/math" xmlns:v="urn:schemas-microsoft-com:vml" xmlns:wp14="http://schemas.microsoft.com/office/word/2010/wordprocessingDrawing" xmlns:wp="http://schemas.openxmlformats.org/drawingml/2006/wordprocessingDrawing" xmlns:w10="urn:schemas-microsoft-com:office:word" xmlns:w="http://schemas.openxmlformats.org/wordprocessingml/2006/main" xmlns:w14="http://schemas.microsoft.com/office/word/2010/wordml" xmlns:w15="http://schemas.microsoft.com/office/word/2012/wordml" xmlns:w16cex="http://schemas.microsoft.com/office/word/2018/wordml/cex" xmlns:w16cid="http://schemas.microsoft.com/office/word/2016/wordml/cid" xmlns:w16="http://schemas.microsoft.com/office/word/2018/wordml" xmlns:w16du="http://schemas.microsoft.com/office/word/2023/wordml/word16du" xmlns:w16sdtdh="http://schemas.microsoft.com/office/word/2020/wordml/sdtdatahash" xmlns:w16sdtfl="http://schemas.microsoft.com/office/word/2024/wordml/sdtformatlock" xmlns:w16se="http://schemas.microsoft.com/office/word/2015/wordml/symex" xmlns:wpg="http://schemas.microsoft.com/office/word/2010/wordprocessingGroup" xmlns:wpi="http://schemas.microsoft.com/office/word/2010/wordprocessingInk" xmlns:wne="http://schemas.microsoft.com/office/word/2006/wordml" xmlns:wps="http://schemas.microsoft.com/office/word/2010/wordprocessingShape" mc:Ignorable="w14 w15 w16se w16cid w16 w16cex w16sdtdh w16sdtfl w16du wp14">
+<w:endnotes xmlns:wpc="http://schemas.microsoft.com/office/word/2010/wordprocessingCanvas" xmlns:cx="http://schemas.microsoft.com/office/drawing/2014/chartex" xmlns:cx1="http://schemas.microsoft.com/office/drawing/2015/9/8/chartex" xmlns:cx2="http://schemas.microsoft.com/office/drawing/2015/10/21/chartex" xmlns:cx3="http://schemas.microsoft.com/office/drawing/2016/5/9/chartex" xmlns:cx4="http://schemas.microsoft.com/office/drawing/2016/5/10/chartex" xmlns:cx5="http://schemas.microsoft.com/office/drawing/2016/5/11/chartex" xmlns:cx6="http://schemas.microsoft.com/office/drawing/2016/5/12/chartex" xmlns:cx7="http://schemas.microsoft.com/office/drawing/2016/5/13/chartex" xmlns:cx8="http://schemas.microsoft.com/office/drawing/2016/5/14/chartex" xmlns:mc="http://schemas.openxmlformats.org/markup-compatibility/2006" xmlns:aink="http://schemas.microsoft.com/office/drawing/2016/ink" xmlns:am3d="http://schemas.microsoft.com/office/drawing/2017/model3d" xmlns:o="urn:schemas-microsoft-com:office:office" xmlns:oel="http://schemas.microsoft.com/office/2019/extlst" xmlns:r="http://schemas.openxmlformats.org/officeDocument/2006/relationships" xmlns:m="http://schemas.openxmlformats.org/officeDocument/2006/math" xmlns:v="urn:schemas-microsoft-com:vml" xmlns:wp14="http://schemas.microsoft.com/office/word/2010/wordprocessingDrawing" xmlns:wp="http://schemas.openxmlformats.org/drawingml/2006/wordprocessingDrawing" xmlns:w10="urn:schemas-microsoft-com:office:word" xmlns:w="http://schemas.openxmlformats.org/wordprocessingml/2006/main" xmlns:w14="http://schemas.microsoft.com/office/word/2010/wordml" xmlns:w15="http://schemas.microsoft.com/office/word/2012/wordml" xmlns:w16cex="http://schemas.microsoft.com/office/word/2018/wordml/cex" xmlns:w16cid="http://schemas.microsoft.com/office/word/2016/wordml/cid" xmlns:w16="http://schemas.microsoft.com/office/word/2018/wordml" xmlns:w16sdtdh="http://schemas.microsoft.com/office/word/2020/wordml/sdtdatahash" xmlns:w16se="http://schemas.microsoft.com/office/word/2015/wordml/symex" xmlns:wpg="http://schemas.microsoft.com/office/word/2010/wordprocessingGroup" xmlns:wpi="http://schemas.microsoft.com/office/word/2010/wordprocessingInk" xmlns:wne="http://schemas.microsoft.com/office/word/2006/wordml" xmlns:wps="http://schemas.microsoft.com/office/word/2010/wordprocessingShape" mc:Ignorable="w14 w15 w16se w16cid w16 w16cex w16sdtdh wp14">
   <w:endnote w:type="separator" w:id="-1">
     <w:p>
       <w:pPr>
@@ -5622,7 +7457,7 @@
 </file>
 
 <file path=word/footnotes.xml><?xml version="1.0" encoding="utf-8"?>
-<w:footnotes xmlns:wpc="http://schemas.microsoft.com/office/word/2010/wordprocessingCanvas" xmlns:cx="http://schemas.microsoft.com/office/drawing/2014/chartex" xmlns:cx1="http://schemas.microsoft.com/office/drawing/2015/9/8/chartex" xmlns:cx2="http://schemas.microsoft.com/office/drawing/2015/10/21/chartex" xmlns:cx3="http://schemas.microsoft.com/office/drawing/2016/5/9/chartex" xmlns:cx4="http://schemas.microsoft.com/office/drawing/2016/5/10/chartex" xmlns:cx5="http://schemas.microsoft.com/office/drawing/2016/5/11/chartex" xmlns:cx6="http://schemas.microsoft.com/office/drawing/2016/5/12/chartex" xmlns:cx7="http://schemas.microsoft.com/office/drawing/2016/5/13/chartex" xmlns:cx8="http://schemas.microsoft.com/office/drawing/2016/5/14/chartex" xmlns:mc="http://schemas.openxmlformats.org/markup-compatibility/2006" xmlns:aink="http://schemas.microsoft.com/office/drawing/2016/ink" xmlns:am3d="http://schemas.microsoft.com/office/drawing/2017/model3d" xmlns:o="urn:schemas-microsoft-com:office:office" xmlns:oel="http://schemas.microsoft.com/office/2019/extlst" xmlns:r="http://schemas.openxmlformats.org/officeDocument/2006/relationships" xmlns:m="http://schemas.openxmlformats.org/officeDocument/2006/math" xmlns:v="urn:schemas-microsoft-com:vml" xmlns:wp14="http://schemas.microsoft.com/office/word/2010/wordprocessingDrawing" xmlns:wp="http://schemas.openxmlformats.org/drawingml/2006/wordprocessingDrawing" xmlns:w10="urn:schemas-microsoft-com:office:word" xmlns:w="http://schemas.openxmlformats.org/wordprocessingml/2006/main" xmlns:w14="http://schemas.microsoft.com/office/word/2010/wordml" xmlns:w15="http://schemas.microsoft.com/office/word/2012/wordml" xmlns:w16cex="http://schemas.microsoft.com/office/word/2018/wordml/cex" xmlns:w16cid="http://schemas.microsoft.com/office/word/2016/wordml/cid" xmlns:w16="http://schemas.microsoft.com/office/word/2018/wordml" xmlns:w16du="http://schemas.microsoft.com/office/word/2023/wordml/word16du" xmlns:w16sdtdh="http://schemas.microsoft.com/office/word/2020/wordml/sdtdatahash" xmlns:w16sdtfl="http://schemas.microsoft.com/office/word/2024/wordml/sdtformatlock" xmlns:w16se="http://schemas.microsoft.com/office/word/2015/wordml/symex" xmlns:wpg="http://schemas.microsoft.com/office/word/2010/wordprocessingGroup" xmlns:wpi="http://schemas.microsoft.com/office/word/2010/wordprocessingInk" xmlns:wne="http://schemas.microsoft.com/office/word/2006/wordml" xmlns:wps="http://schemas.microsoft.com/office/word/2010/wordprocessingShape" mc:Ignorable="w14 w15 w16se w16cid w16 w16cex w16sdtdh w16sdtfl w16du wp14">
+<w:footnotes xmlns:wpc="http://schemas.microsoft.com/office/word/2010/wordprocessingCanvas" xmlns:cx="http://schemas.microsoft.com/office/drawing/2014/chartex" xmlns:cx1="http://schemas.microsoft.com/office/drawing/2015/9/8/chartex" xmlns:cx2="http://schemas.microsoft.com/office/drawing/2015/10/21/chartex" xmlns:cx3="http://schemas.microsoft.com/office/drawing/2016/5/9/chartex" xmlns:cx4="http://schemas.microsoft.com/office/drawing/2016/5/10/chartex" xmlns:cx5="http://schemas.microsoft.com/office/drawing/2016/5/11/chartex" xmlns:cx6="http://schemas.microsoft.com/office/drawing/2016/5/12/chartex" xmlns:cx7="http://schemas.microsoft.com/office/drawing/2016/5/13/chartex" xmlns:cx8="http://schemas.microsoft.com/office/drawing/2016/5/14/chartex" xmlns:mc="http://schemas.openxmlformats.org/markup-compatibility/2006" xmlns:aink="http://schemas.microsoft.com/office/drawing/2016/ink" xmlns:am3d="http://schemas.microsoft.com/office/drawing/2017/model3d" xmlns:o="urn:schemas-microsoft-com:office:office" xmlns:oel="http://schemas.microsoft.com/office/2019/extlst" xmlns:r="http://schemas.openxmlformats.org/officeDocument/2006/relationships" xmlns:m="http://schemas.openxmlformats.org/officeDocument/2006/math" xmlns:v="urn:schemas-microsoft-com:vml" xmlns:wp14="http://schemas.microsoft.com/office/word/2010/wordprocessingDrawing" xmlns:wp="http://schemas.openxmlformats.org/drawingml/2006/wordprocessingDrawing" xmlns:w10="urn:schemas-microsoft-com:office:word" xmlns:w="http://schemas.openxmlformats.org/wordprocessingml/2006/main" xmlns:w14="http://schemas.microsoft.com/office/word/2010/wordml" xmlns:w15="http://schemas.microsoft.com/office/word/2012/wordml" xmlns:w16cex="http://schemas.microsoft.com/office/word/2018/wordml/cex" xmlns:w16cid="http://schemas.microsoft.com/office/word/2016/wordml/cid" xmlns:w16="http://schemas.microsoft.com/office/word/2018/wordml" xmlns:w16sdtdh="http://schemas.microsoft.com/office/word/2020/wordml/sdtdatahash" xmlns:w16se="http://schemas.microsoft.com/office/word/2015/wordml/symex" xmlns:wpg="http://schemas.microsoft.com/office/word/2010/wordprocessingGroup" xmlns:wpi="http://schemas.microsoft.com/office/word/2010/wordprocessingInk" xmlns:wne="http://schemas.microsoft.com/office/word/2006/wordml" xmlns:wps="http://schemas.microsoft.com/office/word/2010/wordprocessingShape" mc:Ignorable="w14 w15 w16se w16cid w16 w16cex w16sdtdh wp14">
   <w:footnote w:type="separator" w:id="-1">
     <w:p>
       <w:pPr>
@@ -5647,7 +7482,7 @@
 </file>
 
 <file path=word/numbering.xml><?xml version="1.0" encoding="utf-8"?>
-<w:numbering xmlns:wpc="http://schemas.microsoft.com/office/word/2010/wordprocessingCanvas" xmlns:cx="http://schemas.microsoft.com/office/drawing/2014/chartex" xmlns:cx1="http://schemas.microsoft.com/office/drawing/2015/9/8/chartex" xmlns:cx2="http://schemas.microsoft.com/office/drawing/2015/10/21/chartex" xmlns:cx3="http://schemas.microsoft.com/office/drawing/2016/5/9/chartex" xmlns:cx4="http://schemas.microsoft.com/office/drawing/2016/5/10/chartex" xmlns:cx5="http://schemas.microsoft.com/office/drawing/2016/5/11/chartex" xmlns:cx6="http://schemas.microsoft.com/office/drawing/2016/5/12/chartex" xmlns:cx7="http://schemas.microsoft.com/office/drawing/2016/5/13/chartex" xmlns:cx8="http://schemas.microsoft.com/office/drawing/2016/5/14/chartex" xmlns:mc="http://schemas.openxmlformats.org/markup-compatibility/2006" xmlns:aink="http://schemas.microsoft.com/office/drawing/2016/ink" xmlns:am3d="http://schemas.microsoft.com/office/drawing/2017/model3d" xmlns:o="urn:schemas-microsoft-com:office:office" xmlns:oel="http://schemas.microsoft.com/office/2019/extlst" xmlns:r="http://schemas.openxmlformats.org/officeDocument/2006/relationships" xmlns:m="http://schemas.openxmlformats.org/officeDocument/2006/math" xmlns:v="urn:schemas-microsoft-com:vml" xmlns:wp14="http://schemas.microsoft.com/office/word/2010/wordprocessingDrawing" xmlns:wp="http://schemas.openxmlformats.org/drawingml/2006/wordprocessingDrawing" xmlns:w10="urn:schemas-microsoft-com:office:word" xmlns:w="http://schemas.openxmlformats.org/wordprocessingml/2006/main" xmlns:w14="http://schemas.microsoft.com/office/word/2010/wordml" xmlns:w15="http://schemas.microsoft.com/office/word/2012/wordml" xmlns:w16cex="http://schemas.microsoft.com/office/word/2018/wordml/cex" xmlns:w16cid="http://schemas.microsoft.com/office/word/2016/wordml/cid" xmlns:w16="http://schemas.microsoft.com/office/word/2018/wordml" xmlns:w16du="http://schemas.microsoft.com/office/word/2023/wordml/word16du" xmlns:w16sdtdh="http://schemas.microsoft.com/office/word/2020/wordml/sdtdatahash" xmlns:w16sdtfl="http://schemas.microsoft.com/office/word/2024/wordml/sdtformatlock" xmlns:w16se="http://schemas.microsoft.com/office/word/2015/wordml/symex" xmlns:wpg="http://schemas.microsoft.com/office/word/2010/wordprocessingGroup" xmlns:wpi="http://schemas.microsoft.com/office/word/2010/wordprocessingInk" xmlns:wne="http://schemas.microsoft.com/office/word/2006/wordml" xmlns:wps="http://schemas.microsoft.com/office/word/2010/wordprocessingShape" mc:Ignorable="w14 w15 w16se w16cid w16 w16cex w16sdtdh w16sdtfl w16du wp14">
+<w:numbering xmlns:wpc="http://schemas.microsoft.com/office/word/2010/wordprocessingCanvas" xmlns:cx="http://schemas.microsoft.com/office/drawing/2014/chartex" xmlns:cx1="http://schemas.microsoft.com/office/drawing/2015/9/8/chartex" xmlns:cx2="http://schemas.microsoft.com/office/drawing/2015/10/21/chartex" xmlns:cx3="http://schemas.microsoft.com/office/drawing/2016/5/9/chartex" xmlns:cx4="http://schemas.microsoft.com/office/drawing/2016/5/10/chartex" xmlns:cx5="http://schemas.microsoft.com/office/drawing/2016/5/11/chartex" xmlns:cx6="http://schemas.microsoft.com/office/drawing/2016/5/12/chartex" xmlns:cx7="http://schemas.microsoft.com/office/drawing/2016/5/13/chartex" xmlns:cx8="http://schemas.microsoft.com/office/drawing/2016/5/14/chartex" xmlns:mc="http://schemas.openxmlformats.org/markup-compatibility/2006" xmlns:aink="http://schemas.microsoft.com/office/drawing/2016/ink" xmlns:am3d="http://schemas.microsoft.com/office/drawing/2017/model3d" xmlns:o="urn:schemas-microsoft-com:office:office" xmlns:oel="http://schemas.microsoft.com/office/2019/extlst" xmlns:r="http://schemas.openxmlformats.org/officeDocument/2006/relationships" xmlns:m="http://schemas.openxmlformats.org/officeDocument/2006/math" xmlns:v="urn:schemas-microsoft-com:vml" xmlns:wp14="http://schemas.microsoft.com/office/word/2010/wordprocessingDrawing" xmlns:wp="http://schemas.openxmlformats.org/drawingml/2006/wordprocessingDrawing" xmlns:w10="urn:schemas-microsoft-com:office:word" xmlns:w="http://schemas.openxmlformats.org/wordprocessingml/2006/main" xmlns:w14="http://schemas.microsoft.com/office/word/2010/wordml" xmlns:w15="http://schemas.microsoft.com/office/word/2012/wordml" xmlns:w16cex="http://schemas.microsoft.com/office/word/2018/wordml/cex" xmlns:w16cid="http://schemas.microsoft.com/office/word/2016/wordml/cid" xmlns:w16="http://schemas.microsoft.com/office/word/2018/wordml" xmlns:w16sdtdh="http://schemas.microsoft.com/office/word/2020/wordml/sdtdatahash" xmlns:w16se="http://schemas.microsoft.com/office/word/2015/wordml/symex" xmlns:wpg="http://schemas.microsoft.com/office/word/2010/wordprocessingGroup" xmlns:wpi="http://schemas.microsoft.com/office/word/2010/wordprocessingInk" xmlns:wne="http://schemas.microsoft.com/office/word/2006/wordml" xmlns:wps="http://schemas.microsoft.com/office/word/2010/wordprocessingShape" mc:Ignorable="w14 w15 w16se w16cid w16 w16cex w16sdtdh wp14">
   <w:abstractNum w:abstractNumId="0" w15:restartNumberingAfterBreak="0">
     <w:nsid w:val="09C75AED"/>
     <w:multiLevelType w:val="hybridMultilevel"/>
@@ -6855,7 +8690,7 @@
 </file>
 
 <file path=word/styles.xml><?xml version="1.0" encoding="utf-8"?>
-<w:styles xmlns:mc="http://schemas.openxmlformats.org/markup-compatibility/2006" xmlns:r="http://schemas.openxmlformats.org/officeDocument/2006/relationships" xmlns:w="http://schemas.openxmlformats.org/wordprocessingml/2006/main" xmlns:w14="http://schemas.microsoft.com/office/word/2010/wordml" xmlns:w15="http://schemas.microsoft.com/office/word/2012/wordml" xmlns:w16cex="http://schemas.microsoft.com/office/word/2018/wordml/cex" xmlns:w16cid="http://schemas.microsoft.com/office/word/2016/wordml/cid" xmlns:w16="http://schemas.microsoft.com/office/word/2018/wordml" xmlns:w16du="http://schemas.microsoft.com/office/word/2023/wordml/word16du" xmlns:w16sdtdh="http://schemas.microsoft.com/office/word/2020/wordml/sdtdatahash" xmlns:w16sdtfl="http://schemas.microsoft.com/office/word/2024/wordml/sdtformatlock" xmlns:w16se="http://schemas.microsoft.com/office/word/2015/wordml/symex" mc:Ignorable="w14 w15 w16se w16cid w16 w16cex w16sdtdh w16sdtfl w16du">
+<w:styles xmlns:mc="http://schemas.openxmlformats.org/markup-compatibility/2006" xmlns:r="http://schemas.openxmlformats.org/officeDocument/2006/relationships" xmlns:w="http://schemas.openxmlformats.org/wordprocessingml/2006/main" xmlns:w14="http://schemas.microsoft.com/office/word/2010/wordml" xmlns:w15="http://schemas.microsoft.com/office/word/2012/wordml" xmlns:w16cex="http://schemas.microsoft.com/office/word/2018/wordml/cex" xmlns:w16cid="http://schemas.microsoft.com/office/word/2016/wordml/cid" xmlns:w16="http://schemas.microsoft.com/office/word/2018/wordml" xmlns:w16sdtdh="http://schemas.microsoft.com/office/word/2020/wordml/sdtdatahash" xmlns:w16se="http://schemas.microsoft.com/office/word/2015/wordml/symex" mc:Ignorable="w14 w15 w16se w16cid w16 w16cex w16sdtdh">
   <w:docDefaults>
     <w:rPrDefault>
       <w:rPr>
@@ -7458,6 +9293,7 @@
   <w:style w:type="character" w:default="1" w:styleId="Fuentedeprrafopredeter">
     <w:name w:val="Default Paragraph Font"/>
     <w:uiPriority w:val="1"/>
+    <w:semiHidden/>
     <w:unhideWhenUsed/>
   </w:style>
   <w:style w:type="table" w:default="1" w:styleId="Tablanormal">
@@ -7869,6 +9705,36 @@
     <w:uiPriority w:val="99"/>
     <w:rsid w:val="005A48DD"/>
   </w:style>
+  <w:style w:type="paragraph" w:customStyle="1" w:styleId="Tesis">
+    <w:name w:val="Tesis"/>
+    <w:basedOn w:val="Normal"/>
+    <w:link w:val="TesisCar"/>
+    <w:qFormat/>
+    <w:rsid w:val="005832CE"/>
+    <w:pPr>
+      <w:spacing w:after="200" w:line="480" w:lineRule="auto"/>
+      <w:ind w:firstLine="720"/>
+      <w:jc w:val="both"/>
+    </w:pPr>
+    <w:rPr>
+      <w:rFonts w:ascii="Arial" w:eastAsia="Calibri" w:hAnsi="Arial" w:cs="Arial"/>
+      <w:kern w:val="0"/>
+      <w:lang w:val="es-VE"/>
+      <w14:ligatures w14:val="none"/>
+    </w:rPr>
+  </w:style>
+  <w:style w:type="character" w:customStyle="1" w:styleId="TesisCar">
+    <w:name w:val="Tesis Car"/>
+    <w:basedOn w:val="Fuentedeprrafopredeter"/>
+    <w:link w:val="Tesis"/>
+    <w:rsid w:val="005832CE"/>
+    <w:rPr>
+      <w:rFonts w:ascii="Arial" w:eastAsia="Calibri" w:hAnsi="Arial" w:cs="Arial"/>
+      <w:kern w:val="0"/>
+      <w:lang w:val="es-VE"/>
+      <w14:ligatures w14:val="none"/>
+    </w:rPr>
+  </w:style>
 </w:styles>
 </file>
 

</xml_diff>